<commit_message>
amending interview control variable
</commit_message>
<xml_diff>
--- a/property-tax-appeal/templates/tax_appeal_letter_template.docx
+++ b/property-tax-appeal/templates/tax_appeal_letter_template.docx
@@ -176,7 +176,7 @@
         </w:rPr>
         <w:t xml:space="preserve">via email to: </w:t>
       </w:r>
-      <w:hyperlink r:id="rId4">
+      <w:hyperlink r:id="rId6">
         <w:r>
           <w:rPr>
             <w:rStyle w:val="Hyperlink"/>
@@ -269,21 +269,28 @@
           <w:rFonts w:ascii="Aptos" w:hAnsi="Aptos"/>
           <w:color w:val="000000"/>
         </w:rPr>
-        <w:t xml:space="preserve">{% if appraisal_value </w:t>
-      </w:r>
-      <w:r>
-        <w:rPr>
-          <w:rFonts w:ascii="Aptos" w:hAnsi="Aptos"/>
-          <w:color w:val="000000"/>
-        </w:rPr>
-        <w:t>!= ‘’</w:t>
-      </w:r>
-      <w:r>
-        <w:rPr>
-          <w:rFonts w:ascii="Aptos" w:hAnsi="Aptos"/>
-          <w:color w:val="000000"/>
-        </w:rPr>
-        <w:t xml:space="preserve"> and appraisal_value &gt;= proposed_value %}</w:t>
+        <w:t xml:space="preserve">{% if </w:t>
+      </w:r>
+      <w:r>
+        <w:rPr>
+          <w:rFonts w:ascii="Aptos" w:hAnsi="Aptos"/>
+          <w:color w:val="000000"/>
+        </w:rPr>
+        <w:t>had</w:t>
+      </w:r>
+      <w:r>
+        <w:rPr>
+          <w:rFonts w:ascii="Aptos" w:hAnsi="Aptos"/>
+          <w:color w:val="000000"/>
+        </w:rPr>
+        <w:t>_appraisal</w:t>
+      </w:r>
+      <w:r>
+        <w:rPr>
+          <w:rFonts w:ascii="Aptos" w:hAnsi="Aptos"/>
+          <w:color w:val="000000"/>
+        </w:rPr>
+        <w:t xml:space="preserve"> %}</w:t>
       </w:r>
     </w:p>
     <w:p>
@@ -351,7 +358,7 @@
           <w:rFonts w:ascii="Aptos" w:hAnsi="Aptos"/>
           <w:color w:val="000000"/>
         </w:rPr>
-        <w:t>{% if explain_property_chars != ‘’ %}</w:t>
+        <w:t>{% if explain_property_chars %}</w:t>
       </w:r>
     </w:p>
     <w:p>
@@ -434,14 +441,14 @@
           <w:rFonts w:ascii="Aptos" w:hAnsi="Aptos"/>
           <w:color w:val="000000"/>
         </w:rPr>
-        <w:t xml:space="preserve"> == ‘No’</w:t>
-      </w:r>
-      <w:r>
-        <w:rPr>
-          <w:rFonts w:ascii="Aptos" w:hAnsi="Aptos"/>
-          <w:color w:val="000000"/>
-        </w:rPr>
-        <w:t xml:space="preserve"> %}</w:t>
+        <w:t xml:space="preserve"> </w:t>
+      </w:r>
+      <w:r>
+        <w:rPr>
+          <w:rFonts w:ascii="Aptos" w:hAnsi="Aptos"/>
+          <w:color w:val="000000"/>
+        </w:rPr>
+        <w:t>%}</w:t>
       </w:r>
     </w:p>
     <w:p>
@@ -909,7 +916,21 @@
           <w:rFonts w:ascii="Aptos" w:hAnsi="Aptos"/>
           <w:color w:val="000000"/>
         </w:rPr>
-        <w:t>{% if market_value %}</w:t>
+        <w:t>{% if market_</w:t>
+      </w:r>
+      <w:r>
+        <w:rPr>
+          <w:rFonts w:ascii="Aptos" w:hAnsi="Aptos"/>
+          <w:color w:val="000000"/>
+        </w:rPr>
+        <w:t>analysis</w:t>
+      </w:r>
+      <w:r>
+        <w:rPr>
+          <w:rFonts w:ascii="Aptos" w:hAnsi="Aptos"/>
+          <w:color w:val="000000"/>
+        </w:rPr>
+        <w:t xml:space="preserve"> %}</w:t>
       </w:r>
     </w:p>
     <w:p>
@@ -1291,6 +1312,8 @@
       </w:pPr>
     </w:p>
     <w:sectPr>
+      <w:headerReference w:type="default" r:id="rId7"/>
+      <w:footerReference w:type="default" r:id="rId8"/>
       <w:pgSz w:w="12240" w:h="15840"/>
       <w:pgMar w:top="1134" w:right="1134" w:bottom="1134" w:left="1134" w:header="0" w:footer="0" w:gutter="0"/>
       <w:cols w:space="720"/>
@@ -1299,6 +1322,64 @@
     </w:sectPr>
   </w:body>
 </w:document>
+</file>
+
+<file path=word/endnotes.xml><?xml version="1.0" encoding="utf-8"?>
+<w:endnotes xmlns:wpc="http://schemas.microsoft.com/office/word/2010/wordprocessingCanvas" xmlns:cx="http://schemas.microsoft.com/office/drawing/2014/chartex" xmlns:cx1="http://schemas.microsoft.com/office/drawing/2015/9/8/chartex" xmlns:cx2="http://schemas.microsoft.com/office/drawing/2015/10/21/chartex" xmlns:cx3="http://schemas.microsoft.com/office/drawing/2016/5/9/chartex" xmlns:cx4="http://schemas.microsoft.com/office/drawing/2016/5/10/chartex" xmlns:cx5="http://schemas.microsoft.com/office/drawing/2016/5/11/chartex" xmlns:cx6="http://schemas.microsoft.com/office/drawing/2016/5/12/chartex" xmlns:cx7="http://schemas.microsoft.com/office/drawing/2016/5/13/chartex" xmlns:cx8="http://schemas.microsoft.com/office/drawing/2016/5/14/chartex" xmlns:mc="http://schemas.openxmlformats.org/markup-compatibility/2006" xmlns:aink="http://schemas.microsoft.com/office/drawing/2016/ink" xmlns:am3d="http://schemas.microsoft.com/office/drawing/2017/model3d" xmlns:o="urn:schemas-microsoft-com:office:office" xmlns:oel="http://schemas.microsoft.com/office/2019/extlst" xmlns:r="http://schemas.openxmlformats.org/officeDocument/2006/relationships" xmlns:m="http://schemas.openxmlformats.org/officeDocument/2006/math" xmlns:v="urn:schemas-microsoft-com:vml" xmlns:wp14="http://schemas.microsoft.com/office/word/2010/wordprocessingDrawing" xmlns:wp="http://schemas.openxmlformats.org/drawingml/2006/wordprocessingDrawing" xmlns:w10="urn:schemas-microsoft-com:office:word" xmlns:w="http://schemas.openxmlformats.org/wordprocessingml/2006/main" xmlns:w14="http://schemas.microsoft.com/office/word/2010/wordml" xmlns:w15="http://schemas.microsoft.com/office/word/2012/wordml" xmlns:w16cex="http://schemas.microsoft.com/office/word/2018/wordml/cex" xmlns:w16cid="http://schemas.microsoft.com/office/word/2016/wordml/cid" xmlns:w16="http://schemas.microsoft.com/office/word/2018/wordml" xmlns:w16du="http://schemas.microsoft.com/office/word/2023/wordml/word16du" xmlns:w16sdtdh="http://schemas.microsoft.com/office/word/2020/wordml/sdtdatahash" xmlns:w16sdtfl="http://schemas.microsoft.com/office/word/2024/wordml/sdtformatlock" xmlns:w16se="http://schemas.microsoft.com/office/word/2015/wordml/symex" xmlns:wpg="http://schemas.microsoft.com/office/word/2010/wordprocessingGroup" xmlns:wpi="http://schemas.microsoft.com/office/word/2010/wordprocessingInk" xmlns:wne="http://schemas.microsoft.com/office/word/2006/wordml" xmlns:wps="http://schemas.microsoft.com/office/word/2010/wordprocessingShape" mc:Ignorable="w14 w15 w16se w16cid w16 w16cex w16sdtdh w16sdtfl w16du wp14">
+  <w:endnote w:type="separator" w:id="-1">
+    <w:p>
+      <w:r>
+        <w:separator/>
+      </w:r>
+    </w:p>
+  </w:endnote>
+  <w:endnote w:type="continuationSeparator" w:id="0">
+    <w:p>
+      <w:r>
+        <w:continuationSeparator/>
+      </w:r>
+    </w:p>
+  </w:endnote>
+</w:endnotes>
+</file>
+
+<file path=word/footer1.xml><?xml version="1.0" encoding="utf-8"?>
+<w:ftr xmlns:wpc="http://schemas.microsoft.com/office/word/2010/wordprocessingCanvas" xmlns:cx="http://schemas.microsoft.com/office/drawing/2014/chartex" xmlns:cx1="http://schemas.microsoft.com/office/drawing/2015/9/8/chartex" xmlns:cx2="http://schemas.microsoft.com/office/drawing/2015/10/21/chartex" xmlns:cx3="http://schemas.microsoft.com/office/drawing/2016/5/9/chartex" xmlns:cx4="http://schemas.microsoft.com/office/drawing/2016/5/10/chartex" xmlns:cx5="http://schemas.microsoft.com/office/drawing/2016/5/11/chartex" xmlns:cx6="http://schemas.microsoft.com/office/drawing/2016/5/12/chartex" xmlns:cx7="http://schemas.microsoft.com/office/drawing/2016/5/13/chartex" xmlns:cx8="http://schemas.microsoft.com/office/drawing/2016/5/14/chartex" xmlns:mc="http://schemas.openxmlformats.org/markup-compatibility/2006" xmlns:aink="http://schemas.microsoft.com/office/drawing/2016/ink" xmlns:am3d="http://schemas.microsoft.com/office/drawing/2017/model3d" xmlns:o="urn:schemas-microsoft-com:office:office" xmlns:oel="http://schemas.microsoft.com/office/2019/extlst" xmlns:r="http://schemas.openxmlformats.org/officeDocument/2006/relationships" xmlns:m="http://schemas.openxmlformats.org/officeDocument/2006/math" xmlns:v="urn:schemas-microsoft-com:vml" xmlns:wp14="http://schemas.microsoft.com/office/word/2010/wordprocessingDrawing" xmlns:wp="http://schemas.openxmlformats.org/drawingml/2006/wordprocessingDrawing" xmlns:w10="urn:schemas-microsoft-com:office:word" xmlns:w="http://schemas.openxmlformats.org/wordprocessingml/2006/main" xmlns:w14="http://schemas.microsoft.com/office/word/2010/wordml" xmlns:w15="http://schemas.microsoft.com/office/word/2012/wordml" xmlns:w16cex="http://schemas.microsoft.com/office/word/2018/wordml/cex" xmlns:w16cid="http://schemas.microsoft.com/office/word/2016/wordml/cid" xmlns:w16="http://schemas.microsoft.com/office/word/2018/wordml" xmlns:w16du="http://schemas.microsoft.com/office/word/2023/wordml/word16du" xmlns:w16sdtdh="http://schemas.microsoft.com/office/word/2020/wordml/sdtdatahash" xmlns:w16sdtfl="http://schemas.microsoft.com/office/word/2024/wordml/sdtformatlock" xmlns:w16se="http://schemas.microsoft.com/office/word/2015/wordml/symex" xmlns:wpg="http://schemas.microsoft.com/office/word/2010/wordprocessingGroup" xmlns:wpi="http://schemas.microsoft.com/office/word/2010/wordprocessingInk" xmlns:wne="http://schemas.microsoft.com/office/word/2006/wordml" xmlns:wps="http://schemas.microsoft.com/office/word/2010/wordprocessingShape" mc:Ignorable="w14 w15 w16se w16cid w16 w16cex w16sdtdh w16sdtfl w16du wp14">
+  <w:p>
+    <w:pPr>
+      <w:pStyle w:val="Footer"/>
+    </w:pPr>
+  </w:p>
+</w:ftr>
+</file>
+
+<file path=word/footnotes.xml><?xml version="1.0" encoding="utf-8"?>
+<w:footnotes xmlns:wpc="http://schemas.microsoft.com/office/word/2010/wordprocessingCanvas" xmlns:cx="http://schemas.microsoft.com/office/drawing/2014/chartex" xmlns:cx1="http://schemas.microsoft.com/office/drawing/2015/9/8/chartex" xmlns:cx2="http://schemas.microsoft.com/office/drawing/2015/10/21/chartex" xmlns:cx3="http://schemas.microsoft.com/office/drawing/2016/5/9/chartex" xmlns:cx4="http://schemas.microsoft.com/office/drawing/2016/5/10/chartex" xmlns:cx5="http://schemas.microsoft.com/office/drawing/2016/5/11/chartex" xmlns:cx6="http://schemas.microsoft.com/office/drawing/2016/5/12/chartex" xmlns:cx7="http://schemas.microsoft.com/office/drawing/2016/5/13/chartex" xmlns:cx8="http://schemas.microsoft.com/office/drawing/2016/5/14/chartex" xmlns:mc="http://schemas.openxmlformats.org/markup-compatibility/2006" xmlns:aink="http://schemas.microsoft.com/office/drawing/2016/ink" xmlns:am3d="http://schemas.microsoft.com/office/drawing/2017/model3d" xmlns:o="urn:schemas-microsoft-com:office:office" xmlns:oel="http://schemas.microsoft.com/office/2019/extlst" xmlns:r="http://schemas.openxmlformats.org/officeDocument/2006/relationships" xmlns:m="http://schemas.openxmlformats.org/officeDocument/2006/math" xmlns:v="urn:schemas-microsoft-com:vml" xmlns:wp14="http://schemas.microsoft.com/office/word/2010/wordprocessingDrawing" xmlns:wp="http://schemas.openxmlformats.org/drawingml/2006/wordprocessingDrawing" xmlns:w10="urn:schemas-microsoft-com:office:word" xmlns:w="http://schemas.openxmlformats.org/wordprocessingml/2006/main" xmlns:w14="http://schemas.microsoft.com/office/word/2010/wordml" xmlns:w15="http://schemas.microsoft.com/office/word/2012/wordml" xmlns:w16cex="http://schemas.microsoft.com/office/word/2018/wordml/cex" xmlns:w16cid="http://schemas.microsoft.com/office/word/2016/wordml/cid" xmlns:w16="http://schemas.microsoft.com/office/word/2018/wordml" xmlns:w16du="http://schemas.microsoft.com/office/word/2023/wordml/word16du" xmlns:w16sdtdh="http://schemas.microsoft.com/office/word/2020/wordml/sdtdatahash" xmlns:w16sdtfl="http://schemas.microsoft.com/office/word/2024/wordml/sdtformatlock" xmlns:w16se="http://schemas.microsoft.com/office/word/2015/wordml/symex" xmlns:wpg="http://schemas.microsoft.com/office/word/2010/wordprocessingGroup" xmlns:wpi="http://schemas.microsoft.com/office/word/2010/wordprocessingInk" xmlns:wne="http://schemas.microsoft.com/office/word/2006/wordml" xmlns:wps="http://schemas.microsoft.com/office/word/2010/wordprocessingShape" mc:Ignorable="w14 w15 w16se w16cid w16 w16cex w16sdtdh w16sdtfl w16du wp14">
+  <w:footnote w:type="separator" w:id="-1">
+    <w:p>
+      <w:r>
+        <w:separator/>
+      </w:r>
+    </w:p>
+  </w:footnote>
+  <w:footnote w:type="continuationSeparator" w:id="0">
+    <w:p>
+      <w:r>
+        <w:continuationSeparator/>
+      </w:r>
+    </w:p>
+  </w:footnote>
+</w:footnotes>
+</file>
+
+<file path=word/header1.xml><?xml version="1.0" encoding="utf-8"?>
+<w:hdr xmlns:wpc="http://schemas.microsoft.com/office/word/2010/wordprocessingCanvas" xmlns:cx="http://schemas.microsoft.com/office/drawing/2014/chartex" xmlns:cx1="http://schemas.microsoft.com/office/drawing/2015/9/8/chartex" xmlns:cx2="http://schemas.microsoft.com/office/drawing/2015/10/21/chartex" xmlns:cx3="http://schemas.microsoft.com/office/drawing/2016/5/9/chartex" xmlns:cx4="http://schemas.microsoft.com/office/drawing/2016/5/10/chartex" xmlns:cx5="http://schemas.microsoft.com/office/drawing/2016/5/11/chartex" xmlns:cx6="http://schemas.microsoft.com/office/drawing/2016/5/12/chartex" xmlns:cx7="http://schemas.microsoft.com/office/drawing/2016/5/13/chartex" xmlns:cx8="http://schemas.microsoft.com/office/drawing/2016/5/14/chartex" xmlns:mc="http://schemas.openxmlformats.org/markup-compatibility/2006" xmlns:aink="http://schemas.microsoft.com/office/drawing/2016/ink" xmlns:am3d="http://schemas.microsoft.com/office/drawing/2017/model3d" xmlns:o="urn:schemas-microsoft-com:office:office" xmlns:oel="http://schemas.microsoft.com/office/2019/extlst" xmlns:r="http://schemas.openxmlformats.org/officeDocument/2006/relationships" xmlns:m="http://schemas.openxmlformats.org/officeDocument/2006/math" xmlns:v="urn:schemas-microsoft-com:vml" xmlns:wp14="http://schemas.microsoft.com/office/word/2010/wordprocessingDrawing" xmlns:wp="http://schemas.openxmlformats.org/drawingml/2006/wordprocessingDrawing" xmlns:w10="urn:schemas-microsoft-com:office:word" xmlns:w="http://schemas.openxmlformats.org/wordprocessingml/2006/main" xmlns:w14="http://schemas.microsoft.com/office/word/2010/wordml" xmlns:w15="http://schemas.microsoft.com/office/word/2012/wordml" xmlns:w16cex="http://schemas.microsoft.com/office/word/2018/wordml/cex" xmlns:w16cid="http://schemas.microsoft.com/office/word/2016/wordml/cid" xmlns:w16="http://schemas.microsoft.com/office/word/2018/wordml" xmlns:w16du="http://schemas.microsoft.com/office/word/2023/wordml/word16du" xmlns:w16sdtdh="http://schemas.microsoft.com/office/word/2020/wordml/sdtdatahash" xmlns:w16sdtfl="http://schemas.microsoft.com/office/word/2024/wordml/sdtformatlock" xmlns:w16se="http://schemas.microsoft.com/office/word/2015/wordml/symex" xmlns:wpg="http://schemas.microsoft.com/office/word/2010/wordprocessingGroup" xmlns:wpi="http://schemas.microsoft.com/office/word/2010/wordprocessingInk" xmlns:wne="http://schemas.microsoft.com/office/word/2006/wordml" xmlns:wps="http://schemas.microsoft.com/office/word/2010/wordprocessingShape" mc:Ignorable="w14 w15 w16se w16cid w16 w16cex w16sdtdh w16sdtfl w16du wp14">
+  <w:p>
+    <w:pPr>
+      <w:pStyle w:val="Header"/>
+    </w:pPr>
+  </w:p>
+</w:hdr>
 </file>
 
 <file path=word/styles.xml><?xml version="1.0" encoding="utf-8"?>
@@ -1789,6 +1870,64 @@
     <w:link w:val="BodyText"/>
     <w:rsid w:val="000E1D95"/>
   </w:style>
+  <w:style w:type="paragraph" w:styleId="Header">
+    <w:name w:val="header"/>
+    <w:basedOn w:val="Normal"/>
+    <w:link w:val="HeaderChar"/>
+    <w:uiPriority w:val="99"/>
+    <w:unhideWhenUsed/>
+    <w:rsid w:val="00202900"/>
+    <w:pPr>
+      <w:tabs>
+        <w:tab w:val="center" w:pos="4680"/>
+        <w:tab w:val="right" w:pos="9360"/>
+      </w:tabs>
+    </w:pPr>
+    <w:rPr>
+      <w:rFonts w:cs="Mangal"/>
+      <w:szCs w:val="21"/>
+    </w:rPr>
+  </w:style>
+  <w:style w:type="character" w:customStyle="1" w:styleId="HeaderChar">
+    <w:name w:val="Header Char"/>
+    <w:basedOn w:val="DefaultParagraphFont"/>
+    <w:link w:val="Header"/>
+    <w:uiPriority w:val="99"/>
+    <w:rsid w:val="00202900"/>
+    <w:rPr>
+      <w:rFonts w:cs="Mangal"/>
+      <w:szCs w:val="21"/>
+    </w:rPr>
+  </w:style>
+  <w:style w:type="paragraph" w:styleId="Footer">
+    <w:name w:val="footer"/>
+    <w:basedOn w:val="Normal"/>
+    <w:link w:val="FooterChar"/>
+    <w:uiPriority w:val="99"/>
+    <w:unhideWhenUsed/>
+    <w:rsid w:val="00202900"/>
+    <w:pPr>
+      <w:tabs>
+        <w:tab w:val="center" w:pos="4680"/>
+        <w:tab w:val="right" w:pos="9360"/>
+      </w:tabs>
+    </w:pPr>
+    <w:rPr>
+      <w:rFonts w:cs="Mangal"/>
+      <w:szCs w:val="21"/>
+    </w:rPr>
+  </w:style>
+  <w:style w:type="character" w:customStyle="1" w:styleId="FooterChar">
+    <w:name w:val="Footer Char"/>
+    <w:basedOn w:val="DefaultParagraphFont"/>
+    <w:link w:val="Footer"/>
+    <w:uiPriority w:val="99"/>
+    <w:rsid w:val="00202900"/>
+    <w:rPr>
+      <w:rFonts w:cs="Mangal"/>
+      <w:szCs w:val="21"/>
+    </w:rPr>
+  </w:style>
 </w:styles>
 </file>
 
@@ -1898,24 +2037,4 @@
   <a:objectDefaults/>
   <a:extraClrSchemeLst/>
 </a:theme>
-</file>
-
-<file path=word/webextensions/taskpanes.xml><?xml version="1.0" encoding="utf-8"?>
-<wetp:taskpanes xmlns:wetp="http://schemas.microsoft.com/office/webextensions/taskpanes/2010/11">
-  <wetp:taskpane dockstate="right" visibility="0" width="525" row="1">
-    <wetp:webextensionref xmlns:r="http://schemas.openxmlformats.org/officeDocument/2006/relationships" r:id="rId1"/>
-  </wetp:taskpane>
-</wetp:taskpanes>
-</file>
-
-<file path=word/webextensions/webextension1.xml><?xml version="1.0" encoding="utf-8"?>
-<we:webextension xmlns:we="http://schemas.microsoft.com/office/webextensions/webextension/2010/11" id="{DA705DCD-5D25-4474-9AA9-6D5D2F8C7FBA}">
-  <we:reference id="wa200000676" version="2.35.37.0" store="en-US" storeType="OMEX"/>
-  <we:alternateReferences>
-    <we:reference id="wa200000676" version="2.35.37.0" store="wa200000676" storeType="OMEX"/>
-  </we:alternateReferences>
-  <we:properties/>
-  <we:bindings/>
-  <we:snapshot xmlns:r="http://schemas.openxmlformats.org/officeDocument/2006/relationships"/>
-</we:webextension>
 </file>
</xml_diff>

<commit_message>
adding separate city and state variables
</commit_message>
<xml_diff>
--- a/property-tax-appeal/templates/tax_appeal_letter_template.docx
+++ b/property-tax-appeal/templates/tax_appeal_letter_template.docx
@@ -86,7 +86,21 @@
           <w:rFonts w:ascii="Aptos" w:hAnsi="Aptos"/>
           <w:color w:val="000000"/>
         </w:rPr>
-        <w:t>{{mailing_citystate}} {{mailing_zipcode}}</w:t>
+        <w:t>{{mailing_city}}</w:t>
+      </w:r>
+      <w:r>
+        <w:rPr>
+          <w:rFonts w:ascii="Aptos" w:hAnsi="Aptos"/>
+          <w:color w:val="000000"/>
+        </w:rPr>
+        <w:t>, {{mailing_state}}</w:t>
+      </w:r>
+      <w:r>
+        <w:rPr>
+          <w:rFonts w:ascii="Aptos" w:hAnsi="Aptos"/>
+          <w:color w:val="000000"/>
+        </w:rPr>
+        <w:t xml:space="preserve"> {{mailing_zipcode}}</w:t>
       </w:r>
     </w:p>
     <w:p>

</xml_diff>

<commit_message>
merging all conflicts from previous commit
</commit_message>
<xml_diff>
--- a/property-tax-appeal/templates/tax_appeal_letter_template.docx
+++ b/property-tax-appeal/templates/tax_appeal_letter_template.docx
@@ -1,6 +1,6 @@
 
 <file path=word/document.xml><?xml version="1.0" encoding="utf-8"?>
-<w:document xmlns:wpc="http://schemas.microsoft.com/office/word/2010/wordprocessingCanvas" xmlns:cx="http://schemas.microsoft.com/office/drawing/2014/chartex" xmlns:cx1="http://schemas.microsoft.com/office/drawing/2015/9/8/chartex" xmlns:cx2="http://schemas.microsoft.com/office/drawing/2015/10/21/chartex" xmlns:cx3="http://schemas.microsoft.com/office/drawing/2016/5/9/chartex" xmlns:cx4="http://schemas.microsoft.com/office/drawing/2016/5/10/chartex" xmlns:cx5="http://schemas.microsoft.com/office/drawing/2016/5/11/chartex" xmlns:cx6="http://schemas.microsoft.com/office/drawing/2016/5/12/chartex" xmlns:cx7="http://schemas.microsoft.com/office/drawing/2016/5/13/chartex" xmlns:cx8="http://schemas.microsoft.com/office/drawing/2016/5/14/chartex" xmlns:mc="http://schemas.openxmlformats.org/markup-compatibility/2006" xmlns:aink="http://schemas.microsoft.com/office/drawing/2016/ink" xmlns:am3d="http://schemas.microsoft.com/office/drawing/2017/model3d" xmlns:o="urn:schemas-microsoft-com:office:office" xmlns:oel="http://schemas.microsoft.com/office/2019/extlst" xmlns:r="http://schemas.openxmlformats.org/officeDocument/2006/relationships" xmlns:m="http://schemas.openxmlformats.org/officeDocument/2006/math" xmlns:v="urn:schemas-microsoft-com:vml" xmlns:wp14="http://schemas.microsoft.com/office/word/2010/wordprocessingDrawing" xmlns:wp="http://schemas.openxmlformats.org/drawingml/2006/wordprocessingDrawing" xmlns:w10="urn:schemas-microsoft-com:office:word" xmlns:w="http://schemas.openxmlformats.org/wordprocessingml/2006/main" xmlns:w14="http://schemas.microsoft.com/office/word/2010/wordml" xmlns:w15="http://schemas.microsoft.com/office/word/2012/wordml" xmlns:w16cex="http://schemas.microsoft.com/office/word/2018/wordml/cex" xmlns:w16cid="http://schemas.microsoft.com/office/word/2016/wordml/cid" xmlns:w16="http://schemas.microsoft.com/office/word/2018/wordml" xmlns:w16du="http://schemas.microsoft.com/office/word/2023/wordml/word16du" xmlns:w16sdtdh="http://schemas.microsoft.com/office/word/2020/wordml/sdtdatahash" xmlns:w16sdtfl="http://schemas.microsoft.com/office/word/2024/wordml/sdtformatlock" xmlns:w16se="http://schemas.microsoft.com/office/word/2015/wordml/symex" xmlns:wpg="http://schemas.microsoft.com/office/word/2010/wordprocessingGroup" xmlns:wpi="http://schemas.microsoft.com/office/word/2010/wordprocessingInk" xmlns:wne="http://schemas.microsoft.com/office/word/2006/wordml" xmlns:wps="http://schemas.microsoft.com/office/word/2010/wordprocessingShape" mc:Ignorable="w14 w15 w16se w16cid w16 w16cex w16sdtdh w16sdtfl w16du wp14">
+<w:document xmlns:wpc="http://schemas.microsoft.com/office/word/2010/wordprocessingCanvas" xmlns:cx="http://schemas.microsoft.com/office/drawing/2014/chartex" xmlns:cx1="http://schemas.microsoft.com/office/drawing/2015/9/8/chartex" xmlns:cx2="http://schemas.microsoft.com/office/drawing/2015/10/21/chartex" xmlns:cx3="http://schemas.microsoft.com/office/drawing/2016/5/9/chartex" xmlns:cx4="http://schemas.microsoft.com/office/drawing/2016/5/10/chartex" xmlns:cx5="http://schemas.microsoft.com/office/drawing/2016/5/11/chartex" xmlns:cx6="http://schemas.microsoft.com/office/drawing/2016/5/12/chartex" xmlns:cx7="http://schemas.microsoft.com/office/drawing/2016/5/13/chartex" xmlns:cx8="http://schemas.microsoft.com/office/drawing/2016/5/14/chartex" xmlns:mc="http://schemas.openxmlformats.org/markup-compatibility/2006" xmlns:aink="http://schemas.microsoft.com/office/drawing/2016/ink" xmlns:am3d="http://schemas.microsoft.com/office/drawing/2017/model3d" xmlns:o="urn:schemas-microsoft-com:office:office" xmlns:oel="http://schemas.microsoft.com/office/2019/extlst" xmlns:r="http://schemas.openxmlformats.org/officeDocument/2006/relationships" xmlns:m="http://schemas.openxmlformats.org/officeDocument/2006/math" xmlns:v="urn:schemas-microsoft-com:vml" xmlns:wp14="http://schemas.microsoft.com/office/word/2010/wordprocessingDrawing" xmlns:wp="http://schemas.openxmlformats.org/drawingml/2006/wordprocessingDrawing" xmlns:w10="urn:schemas-microsoft-com:office:word" xmlns:w="http://schemas.openxmlformats.org/wordprocessingml/2006/main" xmlns:w14="http://schemas.microsoft.com/office/word/2010/wordml" xmlns:w15="http://schemas.microsoft.com/office/word/2012/wordml" xmlns:w16cei="http://schemas.microsoft.com/office/word/2026/wordml/cei" xmlns:w16cex="http://schemas.microsoft.com/office/word/2018/wordml/cex" xmlns:w16cid="http://schemas.microsoft.com/office/word/2016/wordml/cid" xmlns:w16="http://schemas.microsoft.com/office/word/2018/wordml" xmlns:w16du="http://schemas.microsoft.com/office/word/2023/wordml/word16du" xmlns:w16sdtdh="http://schemas.microsoft.com/office/word/2020/wordml/sdtdatahash" xmlns:w16sdtfl="http://schemas.microsoft.com/office/word/2024/wordml/sdtformatlock" xmlns:w16se="http://schemas.microsoft.com/office/word/2015/wordml/symex" xmlns:wpg="http://schemas.microsoft.com/office/word/2010/wordprocessingGroup" xmlns:wpi="http://schemas.microsoft.com/office/word/2010/wordprocessingInk" xmlns:wne="http://schemas.microsoft.com/office/word/2006/wordml" xmlns:wps="http://schemas.microsoft.com/office/word/2010/wordprocessingShape" mc:Ignorable="w14 w15 w16se w16cid w16 w16cex w16sdtdh w16sdtfl w16du wp14">
   <w:body>
     <w:p>
       <w:pPr>
@@ -16,29 +16,85 @@
           <w:rFonts w:ascii="Aptos" w:hAnsi="Aptos"/>
           <w:color w:val="000000"/>
         </w:rPr>
-        <w:t>{{ submit_date }}</w:t>
-      </w:r>
-    </w:p>
-    <w:p>
-      <w:pPr>
-        <w:pStyle w:val="BodyText"/>
-      </w:pPr>
-    </w:p>
-    <w:p>
-      <w:pPr>
-        <w:pStyle w:val="BodyText"/>
-        <w:spacing w:after="160" w:line="307" w:lineRule="auto"/>
-        <w:rPr>
-          <w:rFonts w:ascii="Aptos" w:hAnsi="Aptos"/>
-          <w:color w:val="000000"/>
-        </w:rPr>
-      </w:pPr>
-      <w:r>
-        <w:rPr>
-          <w:rFonts w:ascii="Aptos" w:hAnsi="Aptos"/>
-          <w:color w:val="000000"/>
-        </w:rPr>
-        <w:t>{{ ownername_1 }}{% if ownername_2 %} {{ ownername_2 }}</w:t>
+        <w:t xml:space="preserve">{{ </w:t>
+      </w:r>
+      <w:proofErr w:type="spellStart"/>
+      <w:r>
+        <w:rPr>
+          <w:rFonts w:ascii="Aptos" w:hAnsi="Aptos"/>
+          <w:color w:val="000000"/>
+        </w:rPr>
+        <w:t>submit_date</w:t>
+      </w:r>
+      <w:proofErr w:type="spellEnd"/>
+      <w:r>
+        <w:rPr>
+          <w:rFonts w:ascii="Aptos" w:hAnsi="Aptos"/>
+          <w:color w:val="000000"/>
+        </w:rPr>
+        <w:t xml:space="preserve"> }}</w:t>
+      </w:r>
+    </w:p>
+    <w:p>
+      <w:pPr>
+        <w:pStyle w:val="BodyText"/>
+      </w:pPr>
+    </w:p>
+    <w:p>
+      <w:pPr>
+        <w:pStyle w:val="BodyText"/>
+        <w:spacing w:after="160" w:line="307" w:lineRule="auto"/>
+        <w:rPr>
+          <w:rFonts w:ascii="Aptos" w:hAnsi="Aptos"/>
+          <w:color w:val="000000"/>
+        </w:rPr>
+      </w:pPr>
+      <w:r>
+        <w:rPr>
+          <w:rFonts w:ascii="Aptos" w:hAnsi="Aptos"/>
+          <w:color w:val="000000"/>
+        </w:rPr>
+        <w:t>{{ ownername_</w:t>
+      </w:r>
+      <w:proofErr w:type="gramStart"/>
+      <w:r>
+        <w:rPr>
+          <w:rFonts w:ascii="Aptos" w:hAnsi="Aptos"/>
+          <w:color w:val="000000"/>
+        </w:rPr>
+        <w:t>1 }}{%</w:t>
+      </w:r>
+      <w:proofErr w:type="gramEnd"/>
+      <w:r>
+        <w:rPr>
+          <w:rFonts w:ascii="Aptos" w:hAnsi="Aptos"/>
+          <w:color w:val="000000"/>
+        </w:rPr>
+        <w:t xml:space="preserve"> if ownername_</w:t>
+      </w:r>
+      <w:proofErr w:type="gramStart"/>
+      <w:r>
+        <w:rPr>
+          <w:rFonts w:ascii="Aptos" w:hAnsi="Aptos"/>
+          <w:color w:val="000000"/>
+        </w:rPr>
+        <w:t>2 %} {{</w:t>
+      </w:r>
+      <w:proofErr w:type="gramEnd"/>
+      <w:r>
+        <w:rPr>
+          <w:rFonts w:ascii="Aptos" w:hAnsi="Aptos"/>
+          <w:color w:val="000000"/>
+        </w:rPr>
+        <w:t xml:space="preserve"> ownername_</w:t>
+      </w:r>
+      <w:proofErr w:type="gramStart"/>
+      <w:r>
+        <w:rPr>
+          <w:rFonts w:ascii="Aptos" w:hAnsi="Aptos"/>
+          <w:color w:val="000000"/>
+        </w:rPr>
+        <w:t>2 }}</w:t>
       </w:r>
       <w:r>
         <w:rPr>
@@ -52,8 +108,25 @@
           <w:rFonts w:ascii="Aptos" w:hAnsi="Aptos"/>
           <w:color w:val="000000"/>
         </w:rPr>
-        <w:t>{% endif %}</w:t>
-      </w:r>
+        <w:t>{%</w:t>
+      </w:r>
+      <w:proofErr w:type="gramEnd"/>
+      <w:r>
+        <w:rPr>
+          <w:rFonts w:ascii="Aptos" w:hAnsi="Aptos"/>
+          <w:color w:val="000000"/>
+        </w:rPr>
+        <w:t xml:space="preserve"> </w:t>
+      </w:r>
+      <w:proofErr w:type="gramStart"/>
+      <w:r>
+        <w:rPr>
+          <w:rFonts w:ascii="Aptos" w:hAnsi="Aptos"/>
+          <w:color w:val="000000"/>
+        </w:rPr>
+        <w:t>endif %}</w:t>
+      </w:r>
+      <w:proofErr w:type="gramEnd"/>
     </w:p>
     <w:p>
       <w:pPr>
@@ -86,21 +159,78 @@
           <w:rFonts w:ascii="Aptos" w:hAnsi="Aptos"/>
           <w:color w:val="000000"/>
         </w:rPr>
-        <w:t>{{mailing_city}}</w:t>
-      </w:r>
-      <w:r>
-        <w:rPr>
-          <w:rFonts w:ascii="Aptos" w:hAnsi="Aptos"/>
-          <w:color w:val="000000"/>
-        </w:rPr>
-        <w:t>, {{mailing_state}}</w:t>
-      </w:r>
-      <w:r>
-        <w:rPr>
-          <w:rFonts w:ascii="Aptos" w:hAnsi="Aptos"/>
-          <w:color w:val="000000"/>
-        </w:rPr>
-        <w:t xml:space="preserve"> {{mailing_zipcode}}</w:t>
+        <w:t>{{</w:t>
+      </w:r>
+      <w:proofErr w:type="spellStart"/>
+      <w:r>
+        <w:rPr>
+          <w:rFonts w:ascii="Aptos" w:hAnsi="Aptos"/>
+          <w:color w:val="000000"/>
+        </w:rPr>
+        <w:t>mailing_</w:t>
+      </w:r>
+      <w:proofErr w:type="gramStart"/>
+      <w:r>
+        <w:rPr>
+          <w:rFonts w:ascii="Aptos" w:hAnsi="Aptos"/>
+          <w:color w:val="000000"/>
+        </w:rPr>
+        <w:t>city</w:t>
+      </w:r>
+      <w:proofErr w:type="spellEnd"/>
+      <w:r>
+        <w:rPr>
+          <w:rFonts w:ascii="Aptos" w:hAnsi="Aptos"/>
+          <w:color w:val="000000"/>
+        </w:rPr>
+        <w:t>}}</w:t>
+      </w:r>
+      <w:r>
+        <w:rPr>
+          <w:rFonts w:ascii="Aptos" w:hAnsi="Aptos"/>
+          <w:color w:val="000000"/>
+        </w:rPr>
+        <w:t>, {{</w:t>
+      </w:r>
+      <w:proofErr w:type="spellStart"/>
+      <w:proofErr w:type="gramEnd"/>
+      <w:r>
+        <w:rPr>
+          <w:rFonts w:ascii="Aptos" w:hAnsi="Aptos"/>
+          <w:color w:val="000000"/>
+        </w:rPr>
+        <w:t>mailing_state</w:t>
+      </w:r>
+      <w:proofErr w:type="spellEnd"/>
+      <w:r>
+        <w:rPr>
+          <w:rFonts w:ascii="Aptos" w:hAnsi="Aptos"/>
+          <w:color w:val="000000"/>
+        </w:rPr>
+        <w:t>}}</w:t>
+      </w:r>
+      <w:r>
+        <w:rPr>
+          <w:rFonts w:ascii="Aptos" w:hAnsi="Aptos"/>
+          <w:color w:val="000000"/>
+        </w:rPr>
+        <w:t xml:space="preserve"> {{</w:t>
+      </w:r>
+      <w:proofErr w:type="spellStart"/>
+      <w:r>
+        <w:rPr>
+          <w:rFonts w:ascii="Aptos" w:hAnsi="Aptos"/>
+          <w:color w:val="000000"/>
+        </w:rPr>
+        <w:t>mailing_zipcode</w:t>
+      </w:r>
+      <w:proofErr w:type="spellEnd"/>
+      <w:r>
+        <w:rPr>
+          <w:rFonts w:ascii="Aptos" w:hAnsi="Aptos"/>
+          <w:color w:val="000000"/>
+        </w:rPr>
+        <w:t>}}</w:t>
       </w:r>
     </w:p>
     <w:p>
@@ -190,7 +320,7 @@
         </w:rPr>
         <w:t xml:space="preserve">via email to: </w:t>
       </w:r>
-      <w:hyperlink r:id="rId6">
+      <w:hyperlink r:id="rId4">
         <w:r>
           <w:rPr>
             <w:rStyle w:val="Hyperlink"/>
@@ -285,20 +415,78 @@
         </w:rPr>
         <w:t xml:space="preserve">{% if </w:t>
       </w:r>
-      <w:r>
-        <w:rPr>
-          <w:rFonts w:ascii="Aptos" w:hAnsi="Aptos"/>
-          <w:color w:val="000000"/>
-        </w:rPr>
-        <w:t>had</w:t>
-      </w:r>
-      <w:r>
-        <w:rPr>
-          <w:rFonts w:ascii="Aptos" w:hAnsi="Aptos"/>
-          <w:color w:val="000000"/>
-        </w:rPr>
-        <w:t>_appraisal</w:t>
-      </w:r>
+      <w:proofErr w:type="spellStart"/>
+      <w:r>
+        <w:rPr>
+          <w:rFonts w:ascii="Aptos" w:hAnsi="Aptos"/>
+          <w:color w:val="000000"/>
+        </w:rPr>
+        <w:t>appraisal_value</w:t>
+      </w:r>
+      <w:proofErr w:type="spellEnd"/>
+      <w:r>
+        <w:rPr>
+          <w:rFonts w:ascii="Aptos" w:hAnsi="Aptos"/>
+          <w:color w:val="000000"/>
+        </w:rPr>
+        <w:t xml:space="preserve"> </w:t>
+      </w:r>
+      <w:r>
+        <w:rPr>
+          <w:rFonts w:ascii="Aptos" w:hAnsi="Aptos"/>
+          <w:color w:val="000000"/>
+        </w:rPr>
+        <w:t>!</w:t>
+      </w:r>
+      <w:proofErr w:type="gramStart"/>
+      <w:r>
+        <w:rPr>
+          <w:rFonts w:ascii="Aptos" w:hAnsi="Aptos"/>
+          <w:color w:val="000000"/>
+        </w:rPr>
+        <w:t>= ‘’</w:t>
+      </w:r>
+      <w:proofErr w:type="gramEnd"/>
+      <w:r>
+        <w:rPr>
+          <w:rFonts w:ascii="Aptos" w:hAnsi="Aptos"/>
+          <w:color w:val="000000"/>
+        </w:rPr>
+        <w:t xml:space="preserve"> and </w:t>
+      </w:r>
+      <w:proofErr w:type="spellStart"/>
+      <w:r>
+        <w:rPr>
+          <w:rFonts w:ascii="Aptos" w:hAnsi="Aptos"/>
+          <w:color w:val="000000"/>
+        </w:rPr>
+        <w:t>appraisal_value</w:t>
+      </w:r>
+      <w:proofErr w:type="spellEnd"/>
+      <w:r>
+        <w:rPr>
+          <w:rFonts w:ascii="Aptos" w:hAnsi="Aptos"/>
+          <w:color w:val="000000"/>
+        </w:rPr>
+        <w:t xml:space="preserve"> &gt;= </w:t>
+      </w:r>
+      <w:proofErr w:type="spellStart"/>
+      <w:r>
+        <w:rPr>
+          <w:rFonts w:ascii="Aptos" w:hAnsi="Aptos"/>
+          <w:color w:val="000000"/>
+        </w:rPr>
+        <w:t>proposed_</w:t>
+      </w:r>
+      <w:proofErr w:type="gramStart"/>
+      <w:r>
+        <w:rPr>
+          <w:rFonts w:ascii="Aptos" w:hAnsi="Aptos"/>
+          <w:color w:val="000000"/>
+        </w:rPr>
+        <w:t>value</w:t>
+      </w:r>
+      <w:proofErr w:type="spellEnd"/>
       <w:r>
         <w:rPr>
           <w:rFonts w:ascii="Aptos" w:hAnsi="Aptos"/>
@@ -306,39 +494,113 @@
         </w:rPr>
         <w:t xml:space="preserve"> %}</w:t>
       </w:r>
-    </w:p>
-    <w:p>
-      <w:pPr>
-        <w:pStyle w:val="BodyText"/>
-        <w:spacing w:after="160" w:line="307" w:lineRule="auto"/>
-        <w:rPr>
-          <w:rFonts w:ascii="Aptos" w:hAnsi="Aptos"/>
-          <w:color w:val="000000"/>
-        </w:rPr>
-      </w:pPr>
-      <w:r>
-        <w:rPr>
-          <w:rFonts w:ascii="Aptos" w:hAnsi="Aptos"/>
-          <w:color w:val="000000"/>
-        </w:rPr>
-        <w:t>A recent appraisal determined that my property is worth {{ appraisal_value }}.  Because the City’s assessed value should be 100% of the market value, I request that my property’s assessment be changed to {{ appraisal_value }}.</w:t>
-      </w:r>
-    </w:p>
-    <w:p>
-      <w:pPr>
-        <w:pStyle w:val="BodyText"/>
-        <w:spacing w:after="160" w:line="307" w:lineRule="auto"/>
-        <w:rPr>
-          <w:rFonts w:ascii="Aptos" w:hAnsi="Aptos"/>
-          <w:color w:val="000000"/>
-        </w:rPr>
-      </w:pPr>
-      <w:r>
-        <w:rPr>
-          <w:rFonts w:ascii="Aptos" w:hAnsi="Aptos"/>
-          <w:color w:val="000000"/>
-        </w:rPr>
-        <w:t>{{ appraisal_document }}</w:t>
+      <w:proofErr w:type="gramEnd"/>
+    </w:p>
+    <w:p>
+      <w:pPr>
+        <w:pStyle w:val="BodyText"/>
+        <w:spacing w:after="160" w:line="307" w:lineRule="auto"/>
+        <w:rPr>
+          <w:rFonts w:ascii="Aptos" w:hAnsi="Aptos"/>
+          <w:color w:val="000000"/>
+        </w:rPr>
+      </w:pPr>
+      <w:r>
+        <w:rPr>
+          <w:rFonts w:ascii="Aptos" w:hAnsi="Aptos"/>
+          <w:color w:val="000000"/>
+        </w:rPr>
+        <w:t xml:space="preserve">A recent appraisal determined that my property is worth {{ </w:t>
+      </w:r>
+      <w:proofErr w:type="spellStart"/>
+      <w:r>
+        <w:rPr>
+          <w:rFonts w:ascii="Aptos" w:hAnsi="Aptos"/>
+          <w:color w:val="000000"/>
+        </w:rPr>
+        <w:t>appraisal_</w:t>
+      </w:r>
+      <w:proofErr w:type="gramStart"/>
+      <w:r>
+        <w:rPr>
+          <w:rFonts w:ascii="Aptos" w:hAnsi="Aptos"/>
+          <w:color w:val="000000"/>
+        </w:rPr>
+        <w:t>value</w:t>
+      </w:r>
+      <w:proofErr w:type="spellEnd"/>
+      <w:r>
+        <w:rPr>
+          <w:rFonts w:ascii="Aptos" w:hAnsi="Aptos"/>
+          <w:color w:val="000000"/>
+        </w:rPr>
+        <w:t xml:space="preserve"> }}.</w:t>
+      </w:r>
+      <w:proofErr w:type="gramEnd"/>
+      <w:r>
+        <w:rPr>
+          <w:rFonts w:ascii="Aptos" w:hAnsi="Aptos"/>
+          <w:color w:val="000000"/>
+        </w:rPr>
+        <w:t xml:space="preserve">  Because the City’s assessed value should be 100% of the market value, I request that my property’s assessment be changed to {{ </w:t>
+      </w:r>
+      <w:proofErr w:type="spellStart"/>
+      <w:r>
+        <w:rPr>
+          <w:rFonts w:ascii="Aptos" w:hAnsi="Aptos"/>
+          <w:color w:val="000000"/>
+        </w:rPr>
+        <w:t>appraisal_</w:t>
+      </w:r>
+      <w:proofErr w:type="gramStart"/>
+      <w:r>
+        <w:rPr>
+          <w:rFonts w:ascii="Aptos" w:hAnsi="Aptos"/>
+          <w:color w:val="000000"/>
+        </w:rPr>
+        <w:t>value</w:t>
+      </w:r>
+      <w:proofErr w:type="spellEnd"/>
+      <w:r>
+        <w:rPr>
+          <w:rFonts w:ascii="Aptos" w:hAnsi="Aptos"/>
+          <w:color w:val="000000"/>
+        </w:rPr>
+        <w:t xml:space="preserve"> }}.</w:t>
+      </w:r>
+      <w:proofErr w:type="gramEnd"/>
+    </w:p>
+    <w:p>
+      <w:pPr>
+        <w:pStyle w:val="BodyText"/>
+        <w:spacing w:after="160" w:line="307" w:lineRule="auto"/>
+        <w:rPr>
+          <w:rFonts w:ascii="Aptos" w:hAnsi="Aptos"/>
+          <w:color w:val="000000"/>
+        </w:rPr>
+      </w:pPr>
+      <w:r>
+        <w:rPr>
+          <w:rFonts w:ascii="Aptos" w:hAnsi="Aptos"/>
+          <w:color w:val="000000"/>
+        </w:rPr>
+        <w:t xml:space="preserve">{{ </w:t>
+      </w:r>
+      <w:proofErr w:type="spellStart"/>
+      <w:r>
+        <w:rPr>
+          <w:rFonts w:ascii="Aptos" w:hAnsi="Aptos"/>
+          <w:color w:val="000000"/>
+        </w:rPr>
+        <w:t>appraisal_document</w:t>
+      </w:r>
+      <w:proofErr w:type="spellEnd"/>
+      <w:r>
+        <w:rPr>
+          <w:rFonts w:ascii="Aptos" w:hAnsi="Aptos"/>
+          <w:color w:val="000000"/>
+        </w:rPr>
+        <w:t xml:space="preserve"> }}</w:t>
       </w:r>
     </w:p>
     <w:p>
@@ -372,7 +634,39 @@
           <w:rFonts w:ascii="Aptos" w:hAnsi="Aptos"/>
           <w:color w:val="000000"/>
         </w:rPr>
-        <w:t>{% if explain_property_chars %}</w:t>
+        <w:t xml:space="preserve">{% if </w:t>
+      </w:r>
+      <w:proofErr w:type="spellStart"/>
+      <w:r>
+        <w:rPr>
+          <w:rFonts w:ascii="Aptos" w:hAnsi="Aptos"/>
+          <w:color w:val="000000"/>
+        </w:rPr>
+        <w:t>explain_property_chars</w:t>
+      </w:r>
+      <w:proofErr w:type="spellEnd"/>
+      <w:r>
+        <w:rPr>
+          <w:rFonts w:ascii="Aptos" w:hAnsi="Aptos"/>
+          <w:color w:val="000000"/>
+        </w:rPr>
+        <w:t xml:space="preserve"> !</w:t>
+      </w:r>
+      <w:proofErr w:type="gramStart"/>
+      <w:r>
+        <w:rPr>
+          <w:rFonts w:ascii="Aptos" w:hAnsi="Aptos"/>
+          <w:color w:val="000000"/>
+        </w:rPr>
+        <w:t>= ‘’</w:t>
+      </w:r>
+      <w:proofErr w:type="gramEnd"/>
+      <w:r>
+        <w:rPr>
+          <w:rFonts w:ascii="Aptos" w:hAnsi="Aptos"/>
+          <w:color w:val="000000"/>
+        </w:rPr>
+        <w:t xml:space="preserve"> %}</w:t>
       </w:r>
     </w:p>
     <w:p>
@@ -406,7 +700,23 @@
           <w:rFonts w:ascii="Aptos" w:hAnsi="Aptos"/>
           <w:color w:val="000000"/>
         </w:rPr>
-        <w:t>{{ explain_property_chars }}</w:t>
+        <w:t xml:space="preserve">{{ </w:t>
+      </w:r>
+      <w:proofErr w:type="spellStart"/>
+      <w:r>
+        <w:rPr>
+          <w:rFonts w:ascii="Aptos" w:hAnsi="Aptos"/>
+          <w:color w:val="000000"/>
+        </w:rPr>
+        <w:t>explain_property_chars</w:t>
+      </w:r>
+      <w:proofErr w:type="spellEnd"/>
+      <w:r>
+        <w:rPr>
+          <w:rFonts w:ascii="Aptos" w:hAnsi="Aptos"/>
+          <w:color w:val="000000"/>
+        </w:rPr>
+        <w:t xml:space="preserve"> }}</w:t>
       </w:r>
     </w:p>
     <w:p>
@@ -443,6 +753,7 @@
         <w:lastRenderedPageBreak/>
         <w:t xml:space="preserve">{% if </w:t>
       </w:r>
+      <w:proofErr w:type="spellStart"/>
       <w:r>
         <w:rPr>
           <w:rFonts w:ascii="Aptos" w:hAnsi="Aptos"/>
@@ -450,36 +761,54 @@
         </w:rPr>
         <w:t>condition_correct</w:t>
       </w:r>
-      <w:r>
-        <w:rPr>
-          <w:rFonts w:ascii="Aptos" w:hAnsi="Aptos"/>
-          <w:color w:val="000000"/>
-        </w:rPr>
-        <w:t xml:space="preserve"> </w:t>
-      </w:r>
-      <w:r>
-        <w:rPr>
-          <w:rFonts w:ascii="Aptos" w:hAnsi="Aptos"/>
-          <w:color w:val="000000"/>
-        </w:rPr>
-        <w:t>%}</w:t>
-      </w:r>
-    </w:p>
-    <w:p>
-      <w:pPr>
-        <w:pStyle w:val="BodyText"/>
-        <w:spacing w:after="160" w:line="307" w:lineRule="auto"/>
-        <w:rPr>
-          <w:rFonts w:ascii="Aptos" w:hAnsi="Aptos"/>
-          <w:color w:val="000000"/>
-        </w:rPr>
-      </w:pPr>
-      <w:r>
-        <w:rPr>
-          <w:rFonts w:ascii="Aptos" w:hAnsi="Aptos"/>
-          <w:color w:val="000000"/>
-        </w:rPr>
-        <w:t>My property is currently assessed as being in {{ condition_</w:t>
+      <w:proofErr w:type="spellEnd"/>
+      <w:r>
+        <w:rPr>
+          <w:rFonts w:ascii="Aptos" w:hAnsi="Aptos"/>
+          <w:color w:val="000000"/>
+        </w:rPr>
+        <w:t xml:space="preserve"> == ‘No</w:t>
+      </w:r>
+      <w:proofErr w:type="gramStart"/>
+      <w:r>
+        <w:rPr>
+          <w:rFonts w:ascii="Aptos" w:hAnsi="Aptos"/>
+          <w:color w:val="000000"/>
+        </w:rPr>
+        <w:t>’</w:t>
+      </w:r>
+      <w:r>
+        <w:rPr>
+          <w:rFonts w:ascii="Aptos" w:hAnsi="Aptos"/>
+          <w:color w:val="000000"/>
+        </w:rPr>
+        <w:t xml:space="preserve"> %}</w:t>
+      </w:r>
+      <w:proofErr w:type="gramEnd"/>
+    </w:p>
+    <w:p>
+      <w:pPr>
+        <w:pStyle w:val="BodyText"/>
+        <w:spacing w:after="160" w:line="307" w:lineRule="auto"/>
+        <w:rPr>
+          <w:rFonts w:ascii="Aptos" w:hAnsi="Aptos"/>
+          <w:color w:val="000000"/>
+        </w:rPr>
+      </w:pPr>
+      <w:r>
+        <w:rPr>
+          <w:rFonts w:ascii="Aptos" w:hAnsi="Aptos"/>
+          <w:color w:val="000000"/>
+        </w:rPr>
+        <w:t xml:space="preserve">My property is currently assessed as being in {{ </w:t>
+      </w:r>
+      <w:proofErr w:type="spellStart"/>
+      <w:r>
+        <w:rPr>
+          <w:rFonts w:ascii="Aptos" w:hAnsi="Aptos"/>
+          <w:color w:val="000000"/>
+        </w:rPr>
+        <w:t>condition_</w:t>
       </w:r>
       <w:r>
         <w:rPr>
@@ -488,6 +817,7 @@
         </w:rPr>
         <w:t>code</w:t>
       </w:r>
+      <w:proofErr w:type="spellEnd"/>
       <w:r>
         <w:rPr>
           <w:rFonts w:ascii="Aptos" w:hAnsi="Aptos"/>
@@ -500,7 +830,23 @@
           <w:rFonts w:ascii="Aptos" w:hAnsi="Aptos"/>
           <w:color w:val="000000"/>
         </w:rPr>
-        <w:t>should actually be:</w:t>
+        <w:t xml:space="preserve">should </w:t>
+      </w:r>
+      <w:proofErr w:type="gramStart"/>
+      <w:r>
+        <w:rPr>
+          <w:rFonts w:ascii="Aptos" w:hAnsi="Aptos"/>
+          <w:color w:val="000000"/>
+        </w:rPr>
+        <w:t>actually be</w:t>
+      </w:r>
+      <w:proofErr w:type="gramEnd"/>
+      <w:r>
+        <w:rPr>
+          <w:rFonts w:ascii="Aptos" w:hAnsi="Aptos"/>
+          <w:color w:val="000000"/>
+        </w:rPr>
+        <w:t>:</w:t>
       </w:r>
       <w:r>
         <w:rPr>
@@ -509,6 +855,7 @@
         </w:rPr>
         <w:t xml:space="preserve"> {{ </w:t>
       </w:r>
+      <w:proofErr w:type="spellStart"/>
       <w:r>
         <w:rPr>
           <w:rFonts w:ascii="Aptos" w:hAnsi="Aptos"/>
@@ -523,6 +870,7 @@
         </w:rPr>
         <w:t>condition_</w:t>
       </w:r>
+      <w:proofErr w:type="gramStart"/>
       <w:r>
         <w:rPr>
           <w:rFonts w:ascii="Aptos" w:hAnsi="Aptos"/>
@@ -530,29 +878,54 @@
         </w:rPr>
         <w:t>code</w:t>
       </w:r>
-      <w:r>
-        <w:rPr>
-          <w:rFonts w:ascii="Aptos" w:hAnsi="Aptos"/>
-          <w:color w:val="000000"/>
-        </w:rPr>
-        <w:t xml:space="preserve"> }}. </w:t>
-      </w:r>
-    </w:p>
-    <w:p>
-      <w:pPr>
-        <w:pStyle w:val="BodyText"/>
-        <w:spacing w:after="160" w:line="307" w:lineRule="auto"/>
-        <w:rPr>
-          <w:rFonts w:ascii="Aptos" w:hAnsi="Aptos"/>
-          <w:color w:val="000000"/>
-        </w:rPr>
-      </w:pPr>
-      <w:r>
-        <w:rPr>
-          <w:rFonts w:ascii="Aptos" w:hAnsi="Aptos"/>
-          <w:color w:val="000000"/>
-        </w:rPr>
-        <w:t xml:space="preserve">{% if actual_condition_code == </w:t>
+      <w:proofErr w:type="spellEnd"/>
+      <w:r>
+        <w:rPr>
+          <w:rFonts w:ascii="Aptos" w:hAnsi="Aptos"/>
+          <w:color w:val="000000"/>
+        </w:rPr>
+        <w:t xml:space="preserve"> }}.</w:t>
+      </w:r>
+      <w:proofErr w:type="gramEnd"/>
+      <w:r>
+        <w:rPr>
+          <w:rFonts w:ascii="Aptos" w:hAnsi="Aptos"/>
+          <w:color w:val="000000"/>
+        </w:rPr>
+        <w:t> </w:t>
+      </w:r>
+    </w:p>
+    <w:p>
+      <w:pPr>
+        <w:pStyle w:val="BodyText"/>
+        <w:spacing w:after="160" w:line="307" w:lineRule="auto"/>
+        <w:rPr>
+          <w:rFonts w:ascii="Aptos" w:hAnsi="Aptos"/>
+          <w:color w:val="000000"/>
+        </w:rPr>
+      </w:pPr>
+      <w:r>
+        <w:rPr>
+          <w:rFonts w:ascii="Aptos" w:hAnsi="Aptos"/>
+          <w:color w:val="000000"/>
+        </w:rPr>
+        <w:t xml:space="preserve">{% if </w:t>
+      </w:r>
+      <w:proofErr w:type="spellStart"/>
+      <w:r>
+        <w:rPr>
+          <w:rFonts w:ascii="Aptos" w:hAnsi="Aptos"/>
+          <w:color w:val="000000"/>
+        </w:rPr>
+        <w:t>actual_condition_code</w:t>
+      </w:r>
+      <w:proofErr w:type="spellEnd"/>
+      <w:r>
+        <w:rPr>
+          <w:rFonts w:ascii="Aptos" w:hAnsi="Aptos"/>
+          <w:color w:val="000000"/>
+        </w:rPr>
+        <w:t xml:space="preserve"> == </w:t>
       </w:r>
       <w:r>
         <w:rPr>
@@ -568,6 +941,7 @@
         </w:rPr>
         <w:t>1 New Construction</w:t>
       </w:r>
+      <w:proofErr w:type="gramStart"/>
       <w:r>
         <w:rPr>
           <w:rFonts w:ascii="Aptos" w:hAnsi="Aptos"/>
@@ -575,6 +949,7 @@
         </w:rPr>
         <w:t>’ %}</w:t>
       </w:r>
+      <w:proofErr w:type="gramEnd"/>
     </w:p>
     <w:p>
       <w:pPr>
@@ -599,8 +974,33 @@
           <w:rFonts w:ascii="Aptos" w:hAnsi="Aptos"/>
           <w:color w:val="000000"/>
         </w:rPr>
-        <w:t>{% if actual_condition_code == ‘2 Rehab’ %}</w:t>
-      </w:r>
+        <w:t xml:space="preserve">{% if </w:t>
+      </w:r>
+      <w:proofErr w:type="spellStart"/>
+      <w:r>
+        <w:rPr>
+          <w:rFonts w:ascii="Aptos" w:hAnsi="Aptos"/>
+          <w:color w:val="000000"/>
+        </w:rPr>
+        <w:t>actual_condition_code</w:t>
+      </w:r>
+      <w:proofErr w:type="spellEnd"/>
+      <w:r>
+        <w:rPr>
+          <w:rFonts w:ascii="Aptos" w:hAnsi="Aptos"/>
+          <w:color w:val="000000"/>
+        </w:rPr>
+        <w:t xml:space="preserve"> == ‘2 Rehab</w:t>
+      </w:r>
+      <w:proofErr w:type="gramStart"/>
+      <w:r>
+        <w:rPr>
+          <w:rFonts w:ascii="Aptos" w:hAnsi="Aptos"/>
+          <w:color w:val="000000"/>
+        </w:rPr>
+        <w:t>’ %}</w:t>
+      </w:r>
+      <w:proofErr w:type="gramEnd"/>
     </w:p>
     <w:p>
       <w:pPr>
@@ -625,24 +1025,65 @@
           <w:rFonts w:ascii="Aptos" w:hAnsi="Aptos"/>
           <w:color w:val="000000"/>
         </w:rPr>
-        <w:t>{% if actual_condition_code == ‘3 Above Average’ %}</w:t>
-      </w:r>
-    </w:p>
-    <w:p>
-      <w:pPr>
-        <w:pStyle w:val="BodyText"/>
-        <w:spacing w:after="160" w:line="307" w:lineRule="auto"/>
-        <w:rPr>
-          <w:rFonts w:ascii="Aptos" w:hAnsi="Aptos"/>
-          <w:color w:val="000000"/>
-        </w:rPr>
-      </w:pPr>
-      <w:r>
-        <w:rPr>
-          <w:rFonts w:ascii="Aptos" w:hAnsi="Aptos"/>
-          <w:color w:val="000000"/>
-        </w:rPr>
-        <w:t>The improvements in my home are well-maintained and feature limited depreciation.  However, my home has not had a complete renovation, and therefore should not be characterized as a “Rehab” or “New Construction” for the purposes of my tax assessment.</w:t>
+        <w:t xml:space="preserve">{% if </w:t>
+      </w:r>
+      <w:proofErr w:type="spellStart"/>
+      <w:r>
+        <w:rPr>
+          <w:rFonts w:ascii="Aptos" w:hAnsi="Aptos"/>
+          <w:color w:val="000000"/>
+        </w:rPr>
+        <w:t>actual_condition_code</w:t>
+      </w:r>
+      <w:proofErr w:type="spellEnd"/>
+      <w:r>
+        <w:rPr>
+          <w:rFonts w:ascii="Aptos" w:hAnsi="Aptos"/>
+          <w:color w:val="000000"/>
+        </w:rPr>
+        <w:t xml:space="preserve"> == ‘3 Above Average</w:t>
+      </w:r>
+      <w:proofErr w:type="gramStart"/>
+      <w:r>
+        <w:rPr>
+          <w:rFonts w:ascii="Aptos" w:hAnsi="Aptos"/>
+          <w:color w:val="000000"/>
+        </w:rPr>
+        <w:t>’ %}</w:t>
+      </w:r>
+      <w:proofErr w:type="gramEnd"/>
+    </w:p>
+    <w:p>
+      <w:pPr>
+        <w:pStyle w:val="BodyText"/>
+        <w:spacing w:after="160" w:line="307" w:lineRule="auto"/>
+        <w:rPr>
+          <w:rFonts w:ascii="Aptos" w:hAnsi="Aptos"/>
+          <w:color w:val="000000"/>
+        </w:rPr>
+      </w:pPr>
+      <w:r>
+        <w:rPr>
+          <w:rFonts w:ascii="Aptos" w:hAnsi="Aptos"/>
+          <w:color w:val="000000"/>
+        </w:rPr>
+        <w:t xml:space="preserve">The improvements in my home are well-maintained and feature limited depreciation.  However, my home has not had a complete </w:t>
+      </w:r>
+      <w:proofErr w:type="gramStart"/>
+      <w:r>
+        <w:rPr>
+          <w:rFonts w:ascii="Aptos" w:hAnsi="Aptos"/>
+          <w:color w:val="000000"/>
+        </w:rPr>
+        <w:t>renovation, and</w:t>
+      </w:r>
+      <w:proofErr w:type="gramEnd"/>
+      <w:r>
+        <w:rPr>
+          <w:rFonts w:ascii="Aptos" w:hAnsi="Aptos"/>
+          <w:color w:val="000000"/>
+        </w:rPr>
+        <w:t xml:space="preserve"> therefore should not be characterized as a “Rehab” or “New Construction” for the purposes of my tax assessment.</w:t>
       </w:r>
     </w:p>
     <w:p>
@@ -668,24 +1109,65 @@
           <w:rFonts w:ascii="Aptos" w:hAnsi="Aptos"/>
           <w:color w:val="000000"/>
         </w:rPr>
-        <w:t>{% if actual_condition_code == ‘4 Average’ %}</w:t>
-      </w:r>
-    </w:p>
-    <w:p>
-      <w:pPr>
-        <w:pStyle w:val="BodyText"/>
-        <w:spacing w:after="160" w:line="307" w:lineRule="auto"/>
-        <w:rPr>
-          <w:rFonts w:ascii="Aptos" w:hAnsi="Aptos"/>
-          <w:color w:val="000000"/>
-        </w:rPr>
-      </w:pPr>
-      <w:r>
-        <w:rPr>
-          <w:rFonts w:ascii="Aptos" w:hAnsi="Aptos"/>
-          <w:color w:val="000000"/>
-        </w:rPr>
-        <w:t>The estimated age of my home is close to the actual age.  Some of the short-lived components are near the end of their life expectancy. My property is adequately maintained, but shows normal deterioration and wear and tear, as well as minor deferred maintenance.</w:t>
+        <w:t xml:space="preserve">{% if </w:t>
+      </w:r>
+      <w:proofErr w:type="spellStart"/>
+      <w:r>
+        <w:rPr>
+          <w:rFonts w:ascii="Aptos" w:hAnsi="Aptos"/>
+          <w:color w:val="000000"/>
+        </w:rPr>
+        <w:t>actual_condition_code</w:t>
+      </w:r>
+      <w:proofErr w:type="spellEnd"/>
+      <w:r>
+        <w:rPr>
+          <w:rFonts w:ascii="Aptos" w:hAnsi="Aptos"/>
+          <w:color w:val="000000"/>
+        </w:rPr>
+        <w:t xml:space="preserve"> == ‘4 Average</w:t>
+      </w:r>
+      <w:proofErr w:type="gramStart"/>
+      <w:r>
+        <w:rPr>
+          <w:rFonts w:ascii="Aptos" w:hAnsi="Aptos"/>
+          <w:color w:val="000000"/>
+        </w:rPr>
+        <w:t>’ %}</w:t>
+      </w:r>
+      <w:proofErr w:type="gramEnd"/>
+    </w:p>
+    <w:p>
+      <w:pPr>
+        <w:pStyle w:val="BodyText"/>
+        <w:spacing w:after="160" w:line="307" w:lineRule="auto"/>
+        <w:rPr>
+          <w:rFonts w:ascii="Aptos" w:hAnsi="Aptos"/>
+          <w:color w:val="000000"/>
+        </w:rPr>
+      </w:pPr>
+      <w:r>
+        <w:rPr>
+          <w:rFonts w:ascii="Aptos" w:hAnsi="Aptos"/>
+          <w:color w:val="000000"/>
+        </w:rPr>
+        <w:t>The estimated age of my home is close to the actual age.  Some of the short-lived components are near the end of their life expectancy</w:t>
+      </w:r>
+      <w:proofErr w:type="gramStart"/>
+      <w:r>
+        <w:rPr>
+          <w:rFonts w:ascii="Aptos" w:hAnsi="Aptos"/>
+          <w:color w:val="000000"/>
+        </w:rPr>
+        <w:t xml:space="preserve">. </w:t>
+      </w:r>
+      <w:proofErr w:type="gramEnd"/>
+      <w:r>
+        <w:rPr>
+          <w:rFonts w:ascii="Aptos" w:hAnsi="Aptos"/>
+          <w:color w:val="000000"/>
+        </w:rPr>
+        <w:t>My property is adequately maintained, but shows normal deterioration and wear and tear, as well as minor deferred maintenance.</w:t>
       </w:r>
     </w:p>
     <w:p>
@@ -711,7 +1193,23 @@
           <w:rFonts w:ascii="Aptos" w:hAnsi="Aptos"/>
           <w:color w:val="000000"/>
         </w:rPr>
-        <w:t>{% if actual_condition_code == ‘</w:t>
+        <w:t xml:space="preserve">{% if </w:t>
+      </w:r>
+      <w:proofErr w:type="spellStart"/>
+      <w:r>
+        <w:rPr>
+          <w:rFonts w:ascii="Aptos" w:hAnsi="Aptos"/>
+          <w:color w:val="000000"/>
+        </w:rPr>
+        <w:t>actual_condition_code</w:t>
+      </w:r>
+      <w:proofErr w:type="spellEnd"/>
+      <w:r>
+        <w:rPr>
+          <w:rFonts w:ascii="Aptos" w:hAnsi="Aptos"/>
+          <w:color w:val="000000"/>
+        </w:rPr>
+        <w:t xml:space="preserve"> == ‘</w:t>
       </w:r>
       <w:r>
         <w:rPr>
@@ -720,6 +1218,7 @@
         </w:rPr>
         <w:t>5 Below Average</w:t>
       </w:r>
+      <w:proofErr w:type="gramStart"/>
       <w:r>
         <w:rPr>
           <w:rFonts w:ascii="Aptos" w:hAnsi="Aptos"/>
@@ -727,22 +1226,39 @@
         </w:rPr>
         <w:t>’ %}</w:t>
       </w:r>
-    </w:p>
-    <w:p>
-      <w:pPr>
-        <w:pStyle w:val="BodyText"/>
-        <w:spacing w:after="160" w:line="307" w:lineRule="auto"/>
-        <w:rPr>
-          <w:rFonts w:ascii="Aptos" w:hAnsi="Aptos"/>
-          <w:color w:val="000000"/>
-        </w:rPr>
-      </w:pPr>
-      <w:r>
-        <w:rPr>
-          <w:rFonts w:ascii="Aptos" w:hAnsi="Aptos"/>
-          <w:color w:val="000000"/>
-        </w:rPr>
-        <w:t>My property shows obvious deferred maintenance and is in need of significant repairs.  The utility and livability of my property are somewhat diminished due to these conditions, although the property meets the basic requirements of habitability.</w:t>
+      <w:proofErr w:type="gramEnd"/>
+    </w:p>
+    <w:p>
+      <w:pPr>
+        <w:pStyle w:val="BodyText"/>
+        <w:spacing w:after="160" w:line="307" w:lineRule="auto"/>
+        <w:rPr>
+          <w:rFonts w:ascii="Aptos" w:hAnsi="Aptos"/>
+          <w:color w:val="000000"/>
+        </w:rPr>
+      </w:pPr>
+      <w:r>
+        <w:rPr>
+          <w:rFonts w:ascii="Aptos" w:hAnsi="Aptos"/>
+          <w:color w:val="000000"/>
+        </w:rPr>
+        <w:t xml:space="preserve">My property shows obvious deferred maintenance and </w:t>
+      </w:r>
+      <w:proofErr w:type="gramStart"/>
+      <w:r>
+        <w:rPr>
+          <w:rFonts w:ascii="Aptos" w:hAnsi="Aptos"/>
+          <w:color w:val="000000"/>
+        </w:rPr>
+        <w:t>is in need of</w:t>
+      </w:r>
+      <w:proofErr w:type="gramEnd"/>
+      <w:r>
+        <w:rPr>
+          <w:rFonts w:ascii="Aptos" w:hAnsi="Aptos"/>
+          <w:color w:val="000000"/>
+        </w:rPr>
+        <w:t xml:space="preserve"> significant repairs.  The utility and livability of my property are somewhat diminished due to these conditions, although the property meets the basic requirements of habitability.</w:t>
       </w:r>
     </w:p>
     <w:p>
@@ -768,7 +1284,23 @@
           <w:rFonts w:ascii="Aptos" w:hAnsi="Aptos"/>
           <w:color w:val="000000"/>
         </w:rPr>
-        <w:t>{% if actual_condition_code == ‘</w:t>
+        <w:t xml:space="preserve">{% if </w:t>
+      </w:r>
+      <w:proofErr w:type="spellStart"/>
+      <w:r>
+        <w:rPr>
+          <w:rFonts w:ascii="Aptos" w:hAnsi="Aptos"/>
+          <w:color w:val="000000"/>
+        </w:rPr>
+        <w:t>actual_condition_code</w:t>
+      </w:r>
+      <w:proofErr w:type="spellEnd"/>
+      <w:r>
+        <w:rPr>
+          <w:rFonts w:ascii="Aptos" w:hAnsi="Aptos"/>
+          <w:color w:val="000000"/>
+        </w:rPr>
+        <w:t xml:space="preserve"> == ‘</w:t>
       </w:r>
       <w:r>
         <w:rPr>
@@ -777,6 +1309,7 @@
         </w:rPr>
         <w:t>6 Poor</w:t>
       </w:r>
+      <w:proofErr w:type="gramStart"/>
       <w:r>
         <w:rPr>
           <w:rFonts w:ascii="Aptos" w:hAnsi="Aptos"/>
@@ -784,22 +1317,39 @@
         </w:rPr>
         <w:t>’ %}</w:t>
       </w:r>
-    </w:p>
-    <w:p>
-      <w:pPr>
-        <w:pStyle w:val="BodyText"/>
-        <w:spacing w:after="160" w:line="307" w:lineRule="auto"/>
-        <w:rPr>
-          <w:rFonts w:ascii="Aptos" w:hAnsi="Aptos"/>
-          <w:color w:val="000000"/>
-        </w:rPr>
-      </w:pPr>
-      <w:r>
-        <w:rPr>
-          <w:rFonts w:ascii="Aptos" w:hAnsi="Aptos"/>
-          <w:color w:val="000000"/>
-        </w:rPr>
-        <w:t>My property has substantial damage and/or deferred maintenance, and many or most of the major components of my property need to be replaced.  My property is in need of significant repair or rehabilitation.  My property has conditions severe enough to affect the safety, soundness, or structural integrity of the improvements.</w:t>
+      <w:proofErr w:type="gramEnd"/>
+    </w:p>
+    <w:p>
+      <w:pPr>
+        <w:pStyle w:val="BodyText"/>
+        <w:spacing w:after="160" w:line="307" w:lineRule="auto"/>
+        <w:rPr>
+          <w:rFonts w:ascii="Aptos" w:hAnsi="Aptos"/>
+          <w:color w:val="000000"/>
+        </w:rPr>
+      </w:pPr>
+      <w:r>
+        <w:rPr>
+          <w:rFonts w:ascii="Aptos" w:hAnsi="Aptos"/>
+          <w:color w:val="000000"/>
+        </w:rPr>
+        <w:t xml:space="preserve">My property has substantial damage and/or deferred maintenance, and many or most of the major components of my property need to be replaced.  My property </w:t>
+      </w:r>
+      <w:proofErr w:type="gramStart"/>
+      <w:r>
+        <w:rPr>
+          <w:rFonts w:ascii="Aptos" w:hAnsi="Aptos"/>
+          <w:color w:val="000000"/>
+        </w:rPr>
+        <w:t>is in need of</w:t>
+      </w:r>
+      <w:proofErr w:type="gramEnd"/>
+      <w:r>
+        <w:rPr>
+          <w:rFonts w:ascii="Aptos" w:hAnsi="Aptos"/>
+          <w:color w:val="000000"/>
+        </w:rPr>
+        <w:t xml:space="preserve"> significant repair or rehabilitation.  My property has conditions severe enough to affect the safety, soundness, or structural integrity of the improvements.</w:t>
       </w:r>
     </w:p>
     <w:p>
@@ -825,7 +1375,23 @@
           <w:rFonts w:ascii="Aptos" w:hAnsi="Aptos"/>
           <w:color w:val="000000"/>
         </w:rPr>
-        <w:t>{% if actual_condition_code == ‘</w:t>
+        <w:t xml:space="preserve">{% if </w:t>
+      </w:r>
+      <w:proofErr w:type="spellStart"/>
+      <w:r>
+        <w:rPr>
+          <w:rFonts w:ascii="Aptos" w:hAnsi="Aptos"/>
+          <w:color w:val="000000"/>
+        </w:rPr>
+        <w:t>actual_condition_code</w:t>
+      </w:r>
+      <w:proofErr w:type="spellEnd"/>
+      <w:r>
+        <w:rPr>
+          <w:rFonts w:ascii="Aptos" w:hAnsi="Aptos"/>
+          <w:color w:val="000000"/>
+        </w:rPr>
+        <w:t xml:space="preserve"> == ‘</w:t>
       </w:r>
       <w:r>
         <w:rPr>
@@ -834,6 +1400,7 @@
         </w:rPr>
         <w:t>7 Sealed / Structurally Compromised</w:t>
       </w:r>
+      <w:proofErr w:type="gramStart"/>
       <w:r>
         <w:rPr>
           <w:rFonts w:ascii="Aptos" w:hAnsi="Aptos"/>
@@ -841,6 +1408,7 @@
         </w:rPr>
         <w:t>’ %}</w:t>
       </w:r>
+      <w:proofErr w:type="gramEnd"/>
     </w:p>
     <w:p>
       <w:pPr>
@@ -883,20 +1451,52 @@
           <w:rFonts w:ascii="Aptos" w:hAnsi="Aptos"/>
           <w:color w:val="000000"/>
         </w:rPr>
-        <w:t>{{ condition_description }}</w:t>
-      </w:r>
-    </w:p>
-    <w:p>
-      <w:pPr>
-        <w:pStyle w:val="BodyText"/>
-        <w:spacing w:after="160" w:line="307" w:lineRule="auto"/>
-      </w:pPr>
-      <w:r>
-        <w:rPr>
-          <w:rFonts w:ascii="Aptos" w:hAnsi="Aptos"/>
-          <w:color w:val="000000"/>
-        </w:rPr>
-        <w:t>{{ condition_code_doc }}</w:t>
+        <w:t xml:space="preserve">{{ </w:t>
+      </w:r>
+      <w:proofErr w:type="spellStart"/>
+      <w:r>
+        <w:rPr>
+          <w:rFonts w:ascii="Aptos" w:hAnsi="Aptos"/>
+          <w:color w:val="000000"/>
+        </w:rPr>
+        <w:t>condition_description</w:t>
+      </w:r>
+      <w:proofErr w:type="spellEnd"/>
+      <w:r>
+        <w:rPr>
+          <w:rFonts w:ascii="Aptos" w:hAnsi="Aptos"/>
+          <w:color w:val="000000"/>
+        </w:rPr>
+        <w:t xml:space="preserve"> }}</w:t>
+      </w:r>
+    </w:p>
+    <w:p>
+      <w:pPr>
+        <w:pStyle w:val="BodyText"/>
+        <w:spacing w:after="160" w:line="307" w:lineRule="auto"/>
+      </w:pPr>
+      <w:r>
+        <w:rPr>
+          <w:rFonts w:ascii="Aptos" w:hAnsi="Aptos"/>
+          <w:color w:val="000000"/>
+        </w:rPr>
+        <w:t xml:space="preserve">{{ </w:t>
+      </w:r>
+      <w:proofErr w:type="spellStart"/>
+      <w:r>
+        <w:rPr>
+          <w:rFonts w:ascii="Aptos" w:hAnsi="Aptos"/>
+          <w:color w:val="000000"/>
+        </w:rPr>
+        <w:t>condition_code_doc</w:t>
+      </w:r>
+      <w:proofErr w:type="spellEnd"/>
+      <w:r>
+        <w:rPr>
+          <w:rFonts w:ascii="Aptos" w:hAnsi="Aptos"/>
+          <w:color w:val="000000"/>
+        </w:rPr>
+        <w:t xml:space="preserve"> }}</w:t>
       </w:r>
     </w:p>
     <w:p>
@@ -930,15 +1530,25 @@
           <w:rFonts w:ascii="Aptos" w:hAnsi="Aptos"/>
           <w:color w:val="000000"/>
         </w:rPr>
-        <w:t>{% if market_</w:t>
-      </w:r>
-      <w:r>
-        <w:rPr>
-          <w:rFonts w:ascii="Aptos" w:hAnsi="Aptos"/>
-          <w:color w:val="000000"/>
-        </w:rPr>
-        <w:t>analysis</w:t>
-      </w:r>
+        <w:t xml:space="preserve">{% if </w:t>
+      </w:r>
+      <w:proofErr w:type="spellStart"/>
+      <w:r>
+        <w:rPr>
+          <w:rFonts w:ascii="Aptos" w:hAnsi="Aptos"/>
+          <w:color w:val="000000"/>
+        </w:rPr>
+        <w:t>market_</w:t>
+      </w:r>
+      <w:proofErr w:type="gramStart"/>
+      <w:r>
+        <w:rPr>
+          <w:rFonts w:ascii="Aptos" w:hAnsi="Aptos"/>
+          <w:color w:val="000000"/>
+        </w:rPr>
+        <w:t>value</w:t>
+      </w:r>
+      <w:proofErr w:type="spellEnd"/>
       <w:r>
         <w:rPr>
           <w:rFonts w:ascii="Aptos" w:hAnsi="Aptos"/>
@@ -946,6 +1556,7 @@
         </w:rPr>
         <w:t xml:space="preserve"> %}</w:t>
       </w:r>
+      <w:proofErr w:type="gramEnd"/>
     </w:p>
     <w:p>
       <w:pPr>
@@ -973,6 +1584,7 @@
         </w:rPr>
         <w:t xml:space="preserve">is {{ </w:t>
       </w:r>
+      <w:proofErr w:type="spellStart"/>
       <w:r>
         <w:rPr>
           <w:rFonts w:ascii="Aptos" w:hAnsi="Aptos"/>
@@ -994,6 +1606,7 @@
         </w:rPr>
         <w:t>example</w:t>
       </w:r>
+      <w:proofErr w:type="spellEnd"/>
       <w:r>
         <w:rPr>
           <w:rFonts w:ascii="Aptos" w:hAnsi="Aptos"/>
@@ -1033,25 +1646,75 @@
           <w:rFonts w:ascii="Aptos" w:hAnsi="Aptos"/>
           <w:color w:val="000000"/>
         </w:rPr>
-        <w:t>{% if incorrect_assessment_rationale %}</w:t>
-      </w:r>
-    </w:p>
-    <w:p>
-      <w:pPr>
-        <w:pStyle w:val="BodyText"/>
-        <w:spacing w:after="160" w:line="307" w:lineRule="auto"/>
-        <w:rPr>
-          <w:rFonts w:ascii="Aptos" w:hAnsi="Aptos"/>
-          <w:color w:val="000000"/>
-        </w:rPr>
-      </w:pPr>
-      <w:r>
-        <w:rPr>
-          <w:rFonts w:ascii="Aptos" w:hAnsi="Aptos"/>
-          <w:color w:val="000000"/>
-        </w:rPr>
-        <w:t>I believe my property’s assessed value is incorrect because {{ incorrect_assessment_rationale }}.</w:t>
-      </w:r>
+        <w:t xml:space="preserve">{% if </w:t>
+      </w:r>
+      <w:proofErr w:type="spellStart"/>
+      <w:r>
+        <w:rPr>
+          <w:rFonts w:ascii="Aptos" w:hAnsi="Aptos"/>
+          <w:color w:val="000000"/>
+        </w:rPr>
+        <w:t>incorrect_assessment_</w:t>
+      </w:r>
+      <w:proofErr w:type="gramStart"/>
+      <w:r>
+        <w:rPr>
+          <w:rFonts w:ascii="Aptos" w:hAnsi="Aptos"/>
+          <w:color w:val="000000"/>
+        </w:rPr>
+        <w:t>rationale</w:t>
+      </w:r>
+      <w:proofErr w:type="spellEnd"/>
+      <w:r>
+        <w:rPr>
+          <w:rFonts w:ascii="Aptos" w:hAnsi="Aptos"/>
+          <w:color w:val="000000"/>
+        </w:rPr>
+        <w:t xml:space="preserve"> %}</w:t>
+      </w:r>
+      <w:proofErr w:type="gramEnd"/>
+    </w:p>
+    <w:p>
+      <w:pPr>
+        <w:pStyle w:val="BodyText"/>
+        <w:spacing w:after="160" w:line="307" w:lineRule="auto"/>
+        <w:rPr>
+          <w:rFonts w:ascii="Aptos" w:hAnsi="Aptos"/>
+          <w:color w:val="000000"/>
+        </w:rPr>
+      </w:pPr>
+      <w:r>
+        <w:rPr>
+          <w:rFonts w:ascii="Aptos" w:hAnsi="Aptos"/>
+          <w:color w:val="000000"/>
+        </w:rPr>
+        <w:t xml:space="preserve">I believe my property’s assessed value is incorrect because {{ </w:t>
+      </w:r>
+      <w:proofErr w:type="spellStart"/>
+      <w:r>
+        <w:rPr>
+          <w:rFonts w:ascii="Aptos" w:hAnsi="Aptos"/>
+          <w:color w:val="000000"/>
+        </w:rPr>
+        <w:t>incorrect_assessment_</w:t>
+      </w:r>
+      <w:proofErr w:type="gramStart"/>
+      <w:r>
+        <w:rPr>
+          <w:rFonts w:ascii="Aptos" w:hAnsi="Aptos"/>
+          <w:color w:val="000000"/>
+        </w:rPr>
+        <w:t>rationale</w:t>
+      </w:r>
+      <w:proofErr w:type="spellEnd"/>
+      <w:r>
+        <w:rPr>
+          <w:rFonts w:ascii="Aptos" w:hAnsi="Aptos"/>
+          <w:color w:val="000000"/>
+        </w:rPr>
+        <w:t xml:space="preserve"> }}.</w:t>
+      </w:r>
+      <w:proofErr w:type="gramEnd"/>
     </w:p>
     <w:p>
       <w:pPr>
@@ -1086,12 +1749,29 @@
         </w:rPr>
         <w:t xml:space="preserve">{% if </w:t>
       </w:r>
-      <w:r>
-        <w:rPr>
-          <w:rFonts w:ascii="Aptos" w:hAnsi="Aptos"/>
-          <w:color w:val="000000"/>
-        </w:rPr>
-        <w:t xml:space="preserve">appeal_support </w:t>
+      <w:proofErr w:type="spellStart"/>
+      <w:r>
+        <w:rPr>
+          <w:rFonts w:ascii="Aptos" w:hAnsi="Aptos"/>
+          <w:color w:val="000000"/>
+        </w:rPr>
+        <w:t>appeal_</w:t>
+      </w:r>
+      <w:proofErr w:type="gramStart"/>
+      <w:r>
+        <w:rPr>
+          <w:rFonts w:ascii="Aptos" w:hAnsi="Aptos"/>
+          <w:color w:val="000000"/>
+        </w:rPr>
+        <w:t>support</w:t>
+      </w:r>
+      <w:proofErr w:type="spellEnd"/>
+      <w:r>
+        <w:rPr>
+          <w:rFonts w:ascii="Aptos" w:hAnsi="Aptos"/>
+          <w:color w:val="000000"/>
+        </w:rPr>
+        <w:t xml:space="preserve"> </w:t>
       </w:r>
       <w:r>
         <w:rPr>
@@ -1100,6 +1780,7 @@
         </w:rPr>
         <w:t>%}</w:t>
       </w:r>
+      <w:proofErr w:type="gramEnd"/>
     </w:p>
     <w:p>
       <w:pPr>
@@ -1163,7 +1844,87 @@
           <w:rFonts w:ascii="Aptos" w:hAnsi="Aptos"/>
           <w:color w:val="000000"/>
         </w:rPr>
-        <w:t>I therefore respectfully submit that my property’s assessed value should be {{ proposed_value }}.  If you need any additional information or documentation, I can be reached at {{ phone_number }}, or the mailing address above. </w:t>
+        <w:t xml:space="preserve">I therefore respectfully submit that my property’s assessed value should be {{ </w:t>
+      </w:r>
+      <w:proofErr w:type="spellStart"/>
+      <w:r>
+        <w:rPr>
+          <w:rFonts w:ascii="Aptos" w:hAnsi="Aptos"/>
+          <w:color w:val="000000"/>
+        </w:rPr>
+        <w:t>proposed_</w:t>
+      </w:r>
+      <w:proofErr w:type="gramStart"/>
+      <w:r>
+        <w:rPr>
+          <w:rFonts w:ascii="Aptos" w:hAnsi="Aptos"/>
+          <w:color w:val="000000"/>
+        </w:rPr>
+        <w:t>value</w:t>
+      </w:r>
+      <w:proofErr w:type="spellEnd"/>
+      <w:r>
+        <w:rPr>
+          <w:rFonts w:ascii="Aptos" w:hAnsi="Aptos"/>
+          <w:color w:val="000000"/>
+        </w:rPr>
+        <w:t xml:space="preserve"> }}.</w:t>
+      </w:r>
+      <w:proofErr w:type="gramEnd"/>
+      <w:r>
+        <w:rPr>
+          <w:rFonts w:ascii="Aptos" w:hAnsi="Aptos"/>
+          <w:color w:val="000000"/>
+        </w:rPr>
+        <w:t xml:space="preserve">  If you need any additional information or documentation, I can be reached at {{ </w:t>
+      </w:r>
+      <w:proofErr w:type="spellStart"/>
+      <w:r>
+        <w:rPr>
+          <w:rFonts w:ascii="Aptos" w:hAnsi="Aptos"/>
+          <w:color w:val="000000"/>
+        </w:rPr>
+        <w:t>phone_</w:t>
+      </w:r>
+      <w:proofErr w:type="gramStart"/>
+      <w:r>
+        <w:rPr>
+          <w:rFonts w:ascii="Aptos" w:hAnsi="Aptos"/>
+          <w:color w:val="000000"/>
+        </w:rPr>
+        <w:t>number</w:t>
+      </w:r>
+      <w:proofErr w:type="spellEnd"/>
+      <w:r>
+        <w:rPr>
+          <w:rFonts w:ascii="Aptos" w:hAnsi="Aptos"/>
+          <w:color w:val="000000"/>
+        </w:rPr>
+        <w:t xml:space="preserve"> }},</w:t>
+      </w:r>
+      <w:proofErr w:type="gramEnd"/>
+      <w:r>
+        <w:rPr>
+          <w:rFonts w:ascii="Aptos" w:hAnsi="Aptos"/>
+          <w:color w:val="000000"/>
+        </w:rPr>
+        <w:t xml:space="preserve"> </w:t>
+      </w:r>
+      <w:proofErr w:type="gramStart"/>
+      <w:r>
+        <w:rPr>
+          <w:rFonts w:ascii="Aptos" w:hAnsi="Aptos"/>
+          <w:color w:val="000000"/>
+        </w:rPr>
+        <w:t>or</w:t>
+      </w:r>
+      <w:proofErr w:type="gramEnd"/>
+      <w:r>
+        <w:rPr>
+          <w:rFonts w:ascii="Aptos" w:hAnsi="Aptos"/>
+          <w:color w:val="000000"/>
+        </w:rPr>
+        <w:t xml:space="preserve"> the mailing address above. </w:t>
       </w:r>
     </w:p>
     <w:p>
@@ -1229,7 +1990,15 @@
           <w:rFonts w:ascii="Aptos" w:hAnsi="Aptos"/>
           <w:color w:val="000000"/>
         </w:rPr>
-        <w:t>{{ user</w:t>
+        <w:t xml:space="preserve">{{ </w:t>
+      </w:r>
+      <w:proofErr w:type="spellStart"/>
+      <w:r>
+        <w:rPr>
+          <w:rFonts w:ascii="Aptos" w:hAnsi="Aptos"/>
+          <w:color w:val="000000"/>
+        </w:rPr>
+        <w:t>user</w:t>
       </w:r>
       <w:r>
         <w:rPr>
@@ -1243,25 +2012,90 @@
           <w:rFonts w:ascii="Aptos" w:hAnsi="Aptos"/>
           <w:color w:val="000000"/>
         </w:rPr>
-        <w:t>signature }}</w:t>
-      </w:r>
-    </w:p>
-    <w:p>
-      <w:pPr>
-        <w:pStyle w:val="BodyText"/>
-        <w:spacing w:after="160" w:line="307" w:lineRule="auto"/>
-        <w:rPr>
-          <w:rFonts w:ascii="Aptos" w:hAnsi="Aptos"/>
-          <w:color w:val="000000"/>
-        </w:rPr>
-      </w:pPr>
-      <w:r>
-        <w:rPr>
-          <w:rFonts w:ascii="Aptos" w:hAnsi="Aptos"/>
-          <w:color w:val="000000"/>
-        </w:rPr>
-        <w:t>{{ ownername_1 }}{% if ownername_2 %} &amp; {{ ownername_2 }}{% endif %}</w:t>
-      </w:r>
+        <w:t>signature</w:t>
+      </w:r>
+      <w:proofErr w:type="spellEnd"/>
+      <w:r>
+        <w:rPr>
+          <w:rFonts w:ascii="Aptos" w:hAnsi="Aptos"/>
+          <w:color w:val="000000"/>
+        </w:rPr>
+        <w:t xml:space="preserve"> }}</w:t>
+      </w:r>
+    </w:p>
+    <w:p>
+      <w:pPr>
+        <w:pStyle w:val="BodyText"/>
+        <w:spacing w:after="160" w:line="307" w:lineRule="auto"/>
+        <w:rPr>
+          <w:rFonts w:ascii="Aptos" w:hAnsi="Aptos"/>
+          <w:color w:val="000000"/>
+        </w:rPr>
+      </w:pPr>
+      <w:r>
+        <w:rPr>
+          <w:rFonts w:ascii="Aptos" w:hAnsi="Aptos"/>
+          <w:color w:val="000000"/>
+        </w:rPr>
+        <w:t>{{ ownername_</w:t>
+      </w:r>
+      <w:proofErr w:type="gramStart"/>
+      <w:r>
+        <w:rPr>
+          <w:rFonts w:ascii="Aptos" w:hAnsi="Aptos"/>
+          <w:color w:val="000000"/>
+        </w:rPr>
+        <w:t>1 }}{%</w:t>
+      </w:r>
+      <w:proofErr w:type="gramEnd"/>
+      <w:r>
+        <w:rPr>
+          <w:rFonts w:ascii="Aptos" w:hAnsi="Aptos"/>
+          <w:color w:val="000000"/>
+        </w:rPr>
+        <w:t xml:space="preserve"> if ownername_</w:t>
+      </w:r>
+      <w:proofErr w:type="gramStart"/>
+      <w:r>
+        <w:rPr>
+          <w:rFonts w:ascii="Aptos" w:hAnsi="Aptos"/>
+          <w:color w:val="000000"/>
+        </w:rPr>
+        <w:t>2 %}</w:t>
+      </w:r>
+      <w:proofErr w:type="gramEnd"/>
+      <w:r>
+        <w:rPr>
+          <w:rFonts w:ascii="Aptos" w:hAnsi="Aptos"/>
+          <w:color w:val="000000"/>
+        </w:rPr>
+        <w:t xml:space="preserve"> &amp; {{ ownername_</w:t>
+      </w:r>
+      <w:proofErr w:type="gramStart"/>
+      <w:r>
+        <w:rPr>
+          <w:rFonts w:ascii="Aptos" w:hAnsi="Aptos"/>
+          <w:color w:val="000000"/>
+        </w:rPr>
+        <w:t>2 }}{%</w:t>
+      </w:r>
+      <w:proofErr w:type="gramEnd"/>
+      <w:r>
+        <w:rPr>
+          <w:rFonts w:ascii="Aptos" w:hAnsi="Aptos"/>
+          <w:color w:val="000000"/>
+        </w:rPr>
+        <w:t xml:space="preserve"> </w:t>
+      </w:r>
+      <w:proofErr w:type="gramStart"/>
+      <w:r>
+        <w:rPr>
+          <w:rFonts w:ascii="Aptos" w:hAnsi="Aptos"/>
+          <w:color w:val="000000"/>
+        </w:rPr>
+        <w:t>endif %}</w:t>
+      </w:r>
+      <w:proofErr w:type="gramEnd"/>
     </w:p>
     <w:p>
       <w:pPr>
@@ -1278,24 +2112,65 @@
           <w:color w:val="000000"/>
         </w:rPr>
         <w:lastRenderedPageBreak/>
-        <w:t>{% if appeal_support %}</w:t>
-      </w:r>
-    </w:p>
-    <w:p>
-      <w:pPr>
-        <w:pStyle w:val="BodyText"/>
-        <w:spacing w:after="160" w:line="307" w:lineRule="auto"/>
-        <w:rPr>
-          <w:rFonts w:ascii="Aptos" w:hAnsi="Aptos"/>
-          <w:color w:val="000000"/>
-        </w:rPr>
-      </w:pPr>
-      <w:r>
-        <w:rPr>
-          <w:rFonts w:ascii="Aptos" w:hAnsi="Aptos"/>
-          <w:color w:val="000000"/>
-        </w:rPr>
-        <w:t>{{ appeal_support }}</w:t>
+        <w:t xml:space="preserve">{% if </w:t>
+      </w:r>
+      <w:proofErr w:type="spellStart"/>
+      <w:r>
+        <w:rPr>
+          <w:rFonts w:ascii="Aptos" w:hAnsi="Aptos"/>
+          <w:color w:val="000000"/>
+        </w:rPr>
+        <w:t>appeal_</w:t>
+      </w:r>
+      <w:proofErr w:type="gramStart"/>
+      <w:r>
+        <w:rPr>
+          <w:rFonts w:ascii="Aptos" w:hAnsi="Aptos"/>
+          <w:color w:val="000000"/>
+        </w:rPr>
+        <w:t>support</w:t>
+      </w:r>
+      <w:proofErr w:type="spellEnd"/>
+      <w:r>
+        <w:rPr>
+          <w:rFonts w:ascii="Aptos" w:hAnsi="Aptos"/>
+          <w:color w:val="000000"/>
+        </w:rPr>
+        <w:t xml:space="preserve"> %}</w:t>
+      </w:r>
+      <w:proofErr w:type="gramEnd"/>
+    </w:p>
+    <w:p>
+      <w:pPr>
+        <w:pStyle w:val="BodyText"/>
+        <w:spacing w:after="160" w:line="307" w:lineRule="auto"/>
+        <w:rPr>
+          <w:rFonts w:ascii="Aptos" w:hAnsi="Aptos"/>
+          <w:color w:val="000000"/>
+        </w:rPr>
+      </w:pPr>
+      <w:r>
+        <w:rPr>
+          <w:rFonts w:ascii="Aptos" w:hAnsi="Aptos"/>
+          <w:color w:val="000000"/>
+        </w:rPr>
+        <w:t xml:space="preserve">{{ </w:t>
+      </w:r>
+      <w:proofErr w:type="spellStart"/>
+      <w:r>
+        <w:rPr>
+          <w:rFonts w:ascii="Aptos" w:hAnsi="Aptos"/>
+          <w:color w:val="000000"/>
+        </w:rPr>
+        <w:t>appeal_support</w:t>
+      </w:r>
+      <w:proofErr w:type="spellEnd"/>
+      <w:r>
+        <w:rPr>
+          <w:rFonts w:ascii="Aptos" w:hAnsi="Aptos"/>
+          <w:color w:val="000000"/>
+        </w:rPr>
+        <w:t xml:space="preserve"> }}</w:t>
       </w:r>
     </w:p>
     <w:p>
@@ -1326,8 +2201,6 @@
       </w:pPr>
     </w:p>
     <w:sectPr>
-      <w:headerReference w:type="default" r:id="rId7"/>
-      <w:footerReference w:type="default" r:id="rId8"/>
       <w:pgSz w:w="12240" w:h="15840"/>
       <w:pgMar w:top="1134" w:right="1134" w:bottom="1134" w:left="1134" w:header="0" w:footer="0" w:gutter="0"/>
       <w:cols w:space="720"/>
@@ -1336,64 +2209,6 @@
     </w:sectPr>
   </w:body>
 </w:document>
-</file>
-
-<file path=word/endnotes.xml><?xml version="1.0" encoding="utf-8"?>
-<w:endnotes xmlns:wpc="http://schemas.microsoft.com/office/word/2010/wordprocessingCanvas" xmlns:cx="http://schemas.microsoft.com/office/drawing/2014/chartex" xmlns:cx1="http://schemas.microsoft.com/office/drawing/2015/9/8/chartex" xmlns:cx2="http://schemas.microsoft.com/office/drawing/2015/10/21/chartex" xmlns:cx3="http://schemas.microsoft.com/office/drawing/2016/5/9/chartex" xmlns:cx4="http://schemas.microsoft.com/office/drawing/2016/5/10/chartex" xmlns:cx5="http://schemas.microsoft.com/office/drawing/2016/5/11/chartex" xmlns:cx6="http://schemas.microsoft.com/office/drawing/2016/5/12/chartex" xmlns:cx7="http://schemas.microsoft.com/office/drawing/2016/5/13/chartex" xmlns:cx8="http://schemas.microsoft.com/office/drawing/2016/5/14/chartex" xmlns:mc="http://schemas.openxmlformats.org/markup-compatibility/2006" xmlns:aink="http://schemas.microsoft.com/office/drawing/2016/ink" xmlns:am3d="http://schemas.microsoft.com/office/drawing/2017/model3d" xmlns:o="urn:schemas-microsoft-com:office:office" xmlns:oel="http://schemas.microsoft.com/office/2019/extlst" xmlns:r="http://schemas.openxmlformats.org/officeDocument/2006/relationships" xmlns:m="http://schemas.openxmlformats.org/officeDocument/2006/math" xmlns:v="urn:schemas-microsoft-com:vml" xmlns:wp14="http://schemas.microsoft.com/office/word/2010/wordprocessingDrawing" xmlns:wp="http://schemas.openxmlformats.org/drawingml/2006/wordprocessingDrawing" xmlns:w10="urn:schemas-microsoft-com:office:word" xmlns:w="http://schemas.openxmlformats.org/wordprocessingml/2006/main" xmlns:w14="http://schemas.microsoft.com/office/word/2010/wordml" xmlns:w15="http://schemas.microsoft.com/office/word/2012/wordml" xmlns:w16cex="http://schemas.microsoft.com/office/word/2018/wordml/cex" xmlns:w16cid="http://schemas.microsoft.com/office/word/2016/wordml/cid" xmlns:w16="http://schemas.microsoft.com/office/word/2018/wordml" xmlns:w16du="http://schemas.microsoft.com/office/word/2023/wordml/word16du" xmlns:w16sdtdh="http://schemas.microsoft.com/office/word/2020/wordml/sdtdatahash" xmlns:w16sdtfl="http://schemas.microsoft.com/office/word/2024/wordml/sdtformatlock" xmlns:w16se="http://schemas.microsoft.com/office/word/2015/wordml/symex" xmlns:wpg="http://schemas.microsoft.com/office/word/2010/wordprocessingGroup" xmlns:wpi="http://schemas.microsoft.com/office/word/2010/wordprocessingInk" xmlns:wne="http://schemas.microsoft.com/office/word/2006/wordml" xmlns:wps="http://schemas.microsoft.com/office/word/2010/wordprocessingShape" mc:Ignorable="w14 w15 w16se w16cid w16 w16cex w16sdtdh w16sdtfl w16du wp14">
-  <w:endnote w:type="separator" w:id="-1">
-    <w:p>
-      <w:r>
-        <w:separator/>
-      </w:r>
-    </w:p>
-  </w:endnote>
-  <w:endnote w:type="continuationSeparator" w:id="0">
-    <w:p>
-      <w:r>
-        <w:continuationSeparator/>
-      </w:r>
-    </w:p>
-  </w:endnote>
-</w:endnotes>
-</file>
-
-<file path=word/footer1.xml><?xml version="1.0" encoding="utf-8"?>
-<w:ftr xmlns:wpc="http://schemas.microsoft.com/office/word/2010/wordprocessingCanvas" xmlns:cx="http://schemas.microsoft.com/office/drawing/2014/chartex" xmlns:cx1="http://schemas.microsoft.com/office/drawing/2015/9/8/chartex" xmlns:cx2="http://schemas.microsoft.com/office/drawing/2015/10/21/chartex" xmlns:cx3="http://schemas.microsoft.com/office/drawing/2016/5/9/chartex" xmlns:cx4="http://schemas.microsoft.com/office/drawing/2016/5/10/chartex" xmlns:cx5="http://schemas.microsoft.com/office/drawing/2016/5/11/chartex" xmlns:cx6="http://schemas.microsoft.com/office/drawing/2016/5/12/chartex" xmlns:cx7="http://schemas.microsoft.com/office/drawing/2016/5/13/chartex" xmlns:cx8="http://schemas.microsoft.com/office/drawing/2016/5/14/chartex" xmlns:mc="http://schemas.openxmlformats.org/markup-compatibility/2006" xmlns:aink="http://schemas.microsoft.com/office/drawing/2016/ink" xmlns:am3d="http://schemas.microsoft.com/office/drawing/2017/model3d" xmlns:o="urn:schemas-microsoft-com:office:office" xmlns:oel="http://schemas.microsoft.com/office/2019/extlst" xmlns:r="http://schemas.openxmlformats.org/officeDocument/2006/relationships" xmlns:m="http://schemas.openxmlformats.org/officeDocument/2006/math" xmlns:v="urn:schemas-microsoft-com:vml" xmlns:wp14="http://schemas.microsoft.com/office/word/2010/wordprocessingDrawing" xmlns:wp="http://schemas.openxmlformats.org/drawingml/2006/wordprocessingDrawing" xmlns:w10="urn:schemas-microsoft-com:office:word" xmlns:w="http://schemas.openxmlformats.org/wordprocessingml/2006/main" xmlns:w14="http://schemas.microsoft.com/office/word/2010/wordml" xmlns:w15="http://schemas.microsoft.com/office/word/2012/wordml" xmlns:w16cex="http://schemas.microsoft.com/office/word/2018/wordml/cex" xmlns:w16cid="http://schemas.microsoft.com/office/word/2016/wordml/cid" xmlns:w16="http://schemas.microsoft.com/office/word/2018/wordml" xmlns:w16du="http://schemas.microsoft.com/office/word/2023/wordml/word16du" xmlns:w16sdtdh="http://schemas.microsoft.com/office/word/2020/wordml/sdtdatahash" xmlns:w16sdtfl="http://schemas.microsoft.com/office/word/2024/wordml/sdtformatlock" xmlns:w16se="http://schemas.microsoft.com/office/word/2015/wordml/symex" xmlns:wpg="http://schemas.microsoft.com/office/word/2010/wordprocessingGroup" xmlns:wpi="http://schemas.microsoft.com/office/word/2010/wordprocessingInk" xmlns:wne="http://schemas.microsoft.com/office/word/2006/wordml" xmlns:wps="http://schemas.microsoft.com/office/word/2010/wordprocessingShape" mc:Ignorable="w14 w15 w16se w16cid w16 w16cex w16sdtdh w16sdtfl w16du wp14">
-  <w:p>
-    <w:pPr>
-      <w:pStyle w:val="Footer"/>
-    </w:pPr>
-  </w:p>
-</w:ftr>
-</file>
-
-<file path=word/footnotes.xml><?xml version="1.0" encoding="utf-8"?>
-<w:footnotes xmlns:wpc="http://schemas.microsoft.com/office/word/2010/wordprocessingCanvas" xmlns:cx="http://schemas.microsoft.com/office/drawing/2014/chartex" xmlns:cx1="http://schemas.microsoft.com/office/drawing/2015/9/8/chartex" xmlns:cx2="http://schemas.microsoft.com/office/drawing/2015/10/21/chartex" xmlns:cx3="http://schemas.microsoft.com/office/drawing/2016/5/9/chartex" xmlns:cx4="http://schemas.microsoft.com/office/drawing/2016/5/10/chartex" xmlns:cx5="http://schemas.microsoft.com/office/drawing/2016/5/11/chartex" xmlns:cx6="http://schemas.microsoft.com/office/drawing/2016/5/12/chartex" xmlns:cx7="http://schemas.microsoft.com/office/drawing/2016/5/13/chartex" xmlns:cx8="http://schemas.microsoft.com/office/drawing/2016/5/14/chartex" xmlns:mc="http://schemas.openxmlformats.org/markup-compatibility/2006" xmlns:aink="http://schemas.microsoft.com/office/drawing/2016/ink" xmlns:am3d="http://schemas.microsoft.com/office/drawing/2017/model3d" xmlns:o="urn:schemas-microsoft-com:office:office" xmlns:oel="http://schemas.microsoft.com/office/2019/extlst" xmlns:r="http://schemas.openxmlformats.org/officeDocument/2006/relationships" xmlns:m="http://schemas.openxmlformats.org/officeDocument/2006/math" xmlns:v="urn:schemas-microsoft-com:vml" xmlns:wp14="http://schemas.microsoft.com/office/word/2010/wordprocessingDrawing" xmlns:wp="http://schemas.openxmlformats.org/drawingml/2006/wordprocessingDrawing" xmlns:w10="urn:schemas-microsoft-com:office:word" xmlns:w="http://schemas.openxmlformats.org/wordprocessingml/2006/main" xmlns:w14="http://schemas.microsoft.com/office/word/2010/wordml" xmlns:w15="http://schemas.microsoft.com/office/word/2012/wordml" xmlns:w16cex="http://schemas.microsoft.com/office/word/2018/wordml/cex" xmlns:w16cid="http://schemas.microsoft.com/office/word/2016/wordml/cid" xmlns:w16="http://schemas.microsoft.com/office/word/2018/wordml" xmlns:w16du="http://schemas.microsoft.com/office/word/2023/wordml/word16du" xmlns:w16sdtdh="http://schemas.microsoft.com/office/word/2020/wordml/sdtdatahash" xmlns:w16sdtfl="http://schemas.microsoft.com/office/word/2024/wordml/sdtformatlock" xmlns:w16se="http://schemas.microsoft.com/office/word/2015/wordml/symex" xmlns:wpg="http://schemas.microsoft.com/office/word/2010/wordprocessingGroup" xmlns:wpi="http://schemas.microsoft.com/office/word/2010/wordprocessingInk" xmlns:wne="http://schemas.microsoft.com/office/word/2006/wordml" xmlns:wps="http://schemas.microsoft.com/office/word/2010/wordprocessingShape" mc:Ignorable="w14 w15 w16se w16cid w16 w16cex w16sdtdh w16sdtfl w16du wp14">
-  <w:footnote w:type="separator" w:id="-1">
-    <w:p>
-      <w:r>
-        <w:separator/>
-      </w:r>
-    </w:p>
-  </w:footnote>
-  <w:footnote w:type="continuationSeparator" w:id="0">
-    <w:p>
-      <w:r>
-        <w:continuationSeparator/>
-      </w:r>
-    </w:p>
-  </w:footnote>
-</w:footnotes>
-</file>
-
-<file path=word/header1.xml><?xml version="1.0" encoding="utf-8"?>
-<w:hdr xmlns:wpc="http://schemas.microsoft.com/office/word/2010/wordprocessingCanvas" xmlns:cx="http://schemas.microsoft.com/office/drawing/2014/chartex" xmlns:cx1="http://schemas.microsoft.com/office/drawing/2015/9/8/chartex" xmlns:cx2="http://schemas.microsoft.com/office/drawing/2015/10/21/chartex" xmlns:cx3="http://schemas.microsoft.com/office/drawing/2016/5/9/chartex" xmlns:cx4="http://schemas.microsoft.com/office/drawing/2016/5/10/chartex" xmlns:cx5="http://schemas.microsoft.com/office/drawing/2016/5/11/chartex" xmlns:cx6="http://schemas.microsoft.com/office/drawing/2016/5/12/chartex" xmlns:cx7="http://schemas.microsoft.com/office/drawing/2016/5/13/chartex" xmlns:cx8="http://schemas.microsoft.com/office/drawing/2016/5/14/chartex" xmlns:mc="http://schemas.openxmlformats.org/markup-compatibility/2006" xmlns:aink="http://schemas.microsoft.com/office/drawing/2016/ink" xmlns:am3d="http://schemas.microsoft.com/office/drawing/2017/model3d" xmlns:o="urn:schemas-microsoft-com:office:office" xmlns:oel="http://schemas.microsoft.com/office/2019/extlst" xmlns:r="http://schemas.openxmlformats.org/officeDocument/2006/relationships" xmlns:m="http://schemas.openxmlformats.org/officeDocument/2006/math" xmlns:v="urn:schemas-microsoft-com:vml" xmlns:wp14="http://schemas.microsoft.com/office/word/2010/wordprocessingDrawing" xmlns:wp="http://schemas.openxmlformats.org/drawingml/2006/wordprocessingDrawing" xmlns:w10="urn:schemas-microsoft-com:office:word" xmlns:w="http://schemas.openxmlformats.org/wordprocessingml/2006/main" xmlns:w14="http://schemas.microsoft.com/office/word/2010/wordml" xmlns:w15="http://schemas.microsoft.com/office/word/2012/wordml" xmlns:w16cex="http://schemas.microsoft.com/office/word/2018/wordml/cex" xmlns:w16cid="http://schemas.microsoft.com/office/word/2016/wordml/cid" xmlns:w16="http://schemas.microsoft.com/office/word/2018/wordml" xmlns:w16du="http://schemas.microsoft.com/office/word/2023/wordml/word16du" xmlns:w16sdtdh="http://schemas.microsoft.com/office/word/2020/wordml/sdtdatahash" xmlns:w16sdtfl="http://schemas.microsoft.com/office/word/2024/wordml/sdtformatlock" xmlns:w16se="http://schemas.microsoft.com/office/word/2015/wordml/symex" xmlns:wpg="http://schemas.microsoft.com/office/word/2010/wordprocessingGroup" xmlns:wpi="http://schemas.microsoft.com/office/word/2010/wordprocessingInk" xmlns:wne="http://schemas.microsoft.com/office/word/2006/wordml" xmlns:wps="http://schemas.microsoft.com/office/word/2010/wordprocessingShape" mc:Ignorable="w14 w15 w16se w16cid w16 w16cex w16sdtdh w16sdtfl w16du wp14">
-  <w:p>
-    <w:pPr>
-      <w:pStyle w:val="Header"/>
-    </w:pPr>
-  </w:p>
-</w:hdr>
 </file>
 
 <file path=word/styles.xml><?xml version="1.0" encoding="utf-8"?>
@@ -1884,64 +2699,6 @@
     <w:link w:val="BodyText"/>
     <w:rsid w:val="000E1D95"/>
   </w:style>
-  <w:style w:type="paragraph" w:styleId="Header">
-    <w:name w:val="header"/>
-    <w:basedOn w:val="Normal"/>
-    <w:link w:val="HeaderChar"/>
-    <w:uiPriority w:val="99"/>
-    <w:unhideWhenUsed/>
-    <w:rsid w:val="00202900"/>
-    <w:pPr>
-      <w:tabs>
-        <w:tab w:val="center" w:pos="4680"/>
-        <w:tab w:val="right" w:pos="9360"/>
-      </w:tabs>
-    </w:pPr>
-    <w:rPr>
-      <w:rFonts w:cs="Mangal"/>
-      <w:szCs w:val="21"/>
-    </w:rPr>
-  </w:style>
-  <w:style w:type="character" w:customStyle="1" w:styleId="HeaderChar">
-    <w:name w:val="Header Char"/>
-    <w:basedOn w:val="DefaultParagraphFont"/>
-    <w:link w:val="Header"/>
-    <w:uiPriority w:val="99"/>
-    <w:rsid w:val="00202900"/>
-    <w:rPr>
-      <w:rFonts w:cs="Mangal"/>
-      <w:szCs w:val="21"/>
-    </w:rPr>
-  </w:style>
-  <w:style w:type="paragraph" w:styleId="Footer">
-    <w:name w:val="footer"/>
-    <w:basedOn w:val="Normal"/>
-    <w:link w:val="FooterChar"/>
-    <w:uiPriority w:val="99"/>
-    <w:unhideWhenUsed/>
-    <w:rsid w:val="00202900"/>
-    <w:pPr>
-      <w:tabs>
-        <w:tab w:val="center" w:pos="4680"/>
-        <w:tab w:val="right" w:pos="9360"/>
-      </w:tabs>
-    </w:pPr>
-    <w:rPr>
-      <w:rFonts w:cs="Mangal"/>
-      <w:szCs w:val="21"/>
-    </w:rPr>
-  </w:style>
-  <w:style w:type="character" w:customStyle="1" w:styleId="FooterChar">
-    <w:name w:val="Footer Char"/>
-    <w:basedOn w:val="DefaultParagraphFont"/>
-    <w:link w:val="Footer"/>
-    <w:uiPriority w:val="99"/>
-    <w:rsid w:val="00202900"/>
-    <w:rPr>
-      <w:rFonts w:cs="Mangal"/>
-      <w:szCs w:val="21"/>
-    </w:rPr>
-  </w:style>
 </w:styles>
 </file>
 
@@ -2051,4 +2808,24 @@
   <a:objectDefaults/>
   <a:extraClrSchemeLst/>
 </a:theme>
+</file>
+
+<file path=word/webextensions/taskpanes.xml><?xml version="1.0" encoding="utf-8"?>
+<wetp:taskpanes xmlns:wetp="http://schemas.microsoft.com/office/webextensions/taskpanes/2010/11">
+  <wetp:taskpane dockstate="right" visibility="0" width="525" row="1">
+    <wetp:webextensionref xmlns:r="http://schemas.openxmlformats.org/officeDocument/2006/relationships" r:id="rId1"/>
+  </wetp:taskpane>
+</wetp:taskpanes>
+</file>
+
+<file path=word/webextensions/webextension1.xml><?xml version="1.0" encoding="utf-8"?>
+<we:webextension xmlns:we="http://schemas.microsoft.com/office/webextensions/webextension/2010/11" id="{DA705DCD-5D25-4474-9AA9-6D5D2F8C7FBA}">
+  <we:reference id="wa200000676" version="2.35.37.0" store="en-US" storeType="OMEX"/>
+  <we:alternateReferences>
+    <we:reference id="wa200000676" version="2.35.37.0" store="wa200000676" storeType="OMEX"/>
+  </we:alternateReferences>
+  <we:properties/>
+  <we:bindings/>
+  <we:snapshot xmlns:r="http://schemas.openxmlformats.org/officeDocument/2006/relationships"/>
+</we:webextension>
 </file>
</xml_diff>

<commit_message>
separating mailing_city and mailing_state in letter template
</commit_message>
<xml_diff>
--- a/property-tax-appeal/templates/tax_appeal_letter_template.docx
+++ b/property-tax-appeal/templates/tax_appeal_letter_template.docx
@@ -320,7 +320,7 @@
         </w:rPr>
         <w:t xml:space="preserve">via email to: </w:t>
       </w:r>
-      <w:hyperlink r:id="rId4">
+      <w:hyperlink r:id="rId6">
         <w:r>
           <w:rPr>
             <w:rStyle w:val="Hyperlink"/>
@@ -2209,6 +2209,44 @@
     </w:sectPr>
   </w:body>
 </w:document>
+</file>
+
+<file path=word/endnotes.xml><?xml version="1.0" encoding="utf-8"?>
+<w:endnotes xmlns:wpc="http://schemas.microsoft.com/office/word/2010/wordprocessingCanvas" xmlns:cx="http://schemas.microsoft.com/office/drawing/2014/chartex" xmlns:cx1="http://schemas.microsoft.com/office/drawing/2015/9/8/chartex" xmlns:cx2="http://schemas.microsoft.com/office/drawing/2015/10/21/chartex" xmlns:cx3="http://schemas.microsoft.com/office/drawing/2016/5/9/chartex" xmlns:cx4="http://schemas.microsoft.com/office/drawing/2016/5/10/chartex" xmlns:cx5="http://schemas.microsoft.com/office/drawing/2016/5/11/chartex" xmlns:cx6="http://schemas.microsoft.com/office/drawing/2016/5/12/chartex" xmlns:cx7="http://schemas.microsoft.com/office/drawing/2016/5/13/chartex" xmlns:cx8="http://schemas.microsoft.com/office/drawing/2016/5/14/chartex" xmlns:mc="http://schemas.openxmlformats.org/markup-compatibility/2006" xmlns:aink="http://schemas.microsoft.com/office/drawing/2016/ink" xmlns:am3d="http://schemas.microsoft.com/office/drawing/2017/model3d" xmlns:o="urn:schemas-microsoft-com:office:office" xmlns:oel="http://schemas.microsoft.com/office/2019/extlst" xmlns:r="http://schemas.openxmlformats.org/officeDocument/2006/relationships" xmlns:m="http://schemas.openxmlformats.org/officeDocument/2006/math" xmlns:v="urn:schemas-microsoft-com:vml" xmlns:wp14="http://schemas.microsoft.com/office/word/2010/wordprocessingDrawing" xmlns:wp="http://schemas.openxmlformats.org/drawingml/2006/wordprocessingDrawing" xmlns:w10="urn:schemas-microsoft-com:office:word" xmlns:w="http://schemas.openxmlformats.org/wordprocessingml/2006/main" xmlns:w14="http://schemas.microsoft.com/office/word/2010/wordml" xmlns:w15="http://schemas.microsoft.com/office/word/2012/wordml" xmlns:w16cei="http://schemas.microsoft.com/office/word/2026/wordml/cei" xmlns:w16cex="http://schemas.microsoft.com/office/word/2018/wordml/cex" xmlns:w16cid="http://schemas.microsoft.com/office/word/2016/wordml/cid" xmlns:w16="http://schemas.microsoft.com/office/word/2018/wordml" xmlns:w16du="http://schemas.microsoft.com/office/word/2023/wordml/word16du" xmlns:w16sdtdh="http://schemas.microsoft.com/office/word/2020/wordml/sdtdatahash" xmlns:w16sdtfl="http://schemas.microsoft.com/office/word/2024/wordml/sdtformatlock" xmlns:w16se="http://schemas.microsoft.com/office/word/2015/wordml/symex" xmlns:wpg="http://schemas.microsoft.com/office/word/2010/wordprocessingGroup" xmlns:wpi="http://schemas.microsoft.com/office/word/2010/wordprocessingInk" xmlns:wne="http://schemas.microsoft.com/office/word/2006/wordml" xmlns:wps="http://schemas.microsoft.com/office/word/2010/wordprocessingShape" mc:Ignorable="w14 w15 w16se w16cid w16 w16cex w16sdtdh w16sdtfl w16du wp14">
+  <w:endnote w:type="separator" w:id="-1">
+    <w:p>
+      <w:r>
+        <w:separator/>
+      </w:r>
+    </w:p>
+  </w:endnote>
+  <w:endnote w:type="continuationSeparator" w:id="0">
+    <w:p>
+      <w:r>
+        <w:continuationSeparator/>
+      </w:r>
+    </w:p>
+  </w:endnote>
+</w:endnotes>
+</file>
+
+<file path=word/footnotes.xml><?xml version="1.0" encoding="utf-8"?>
+<w:footnotes xmlns:wpc="http://schemas.microsoft.com/office/word/2010/wordprocessingCanvas" xmlns:cx="http://schemas.microsoft.com/office/drawing/2014/chartex" xmlns:cx1="http://schemas.microsoft.com/office/drawing/2015/9/8/chartex" xmlns:cx2="http://schemas.microsoft.com/office/drawing/2015/10/21/chartex" xmlns:cx3="http://schemas.microsoft.com/office/drawing/2016/5/9/chartex" xmlns:cx4="http://schemas.microsoft.com/office/drawing/2016/5/10/chartex" xmlns:cx5="http://schemas.microsoft.com/office/drawing/2016/5/11/chartex" xmlns:cx6="http://schemas.microsoft.com/office/drawing/2016/5/12/chartex" xmlns:cx7="http://schemas.microsoft.com/office/drawing/2016/5/13/chartex" xmlns:cx8="http://schemas.microsoft.com/office/drawing/2016/5/14/chartex" xmlns:mc="http://schemas.openxmlformats.org/markup-compatibility/2006" xmlns:aink="http://schemas.microsoft.com/office/drawing/2016/ink" xmlns:am3d="http://schemas.microsoft.com/office/drawing/2017/model3d" xmlns:o="urn:schemas-microsoft-com:office:office" xmlns:oel="http://schemas.microsoft.com/office/2019/extlst" xmlns:r="http://schemas.openxmlformats.org/officeDocument/2006/relationships" xmlns:m="http://schemas.openxmlformats.org/officeDocument/2006/math" xmlns:v="urn:schemas-microsoft-com:vml" xmlns:wp14="http://schemas.microsoft.com/office/word/2010/wordprocessingDrawing" xmlns:wp="http://schemas.openxmlformats.org/drawingml/2006/wordprocessingDrawing" xmlns:w10="urn:schemas-microsoft-com:office:word" xmlns:w="http://schemas.openxmlformats.org/wordprocessingml/2006/main" xmlns:w14="http://schemas.microsoft.com/office/word/2010/wordml" xmlns:w15="http://schemas.microsoft.com/office/word/2012/wordml" xmlns:w16cei="http://schemas.microsoft.com/office/word/2026/wordml/cei" xmlns:w16cex="http://schemas.microsoft.com/office/word/2018/wordml/cex" xmlns:w16cid="http://schemas.microsoft.com/office/word/2016/wordml/cid" xmlns:w16="http://schemas.microsoft.com/office/word/2018/wordml" xmlns:w16du="http://schemas.microsoft.com/office/word/2023/wordml/word16du" xmlns:w16sdtdh="http://schemas.microsoft.com/office/word/2020/wordml/sdtdatahash" xmlns:w16sdtfl="http://schemas.microsoft.com/office/word/2024/wordml/sdtformatlock" xmlns:w16se="http://schemas.microsoft.com/office/word/2015/wordml/symex" xmlns:wpg="http://schemas.microsoft.com/office/word/2010/wordprocessingGroup" xmlns:wpi="http://schemas.microsoft.com/office/word/2010/wordprocessingInk" xmlns:wne="http://schemas.microsoft.com/office/word/2006/wordml" xmlns:wps="http://schemas.microsoft.com/office/word/2010/wordprocessingShape" mc:Ignorable="w14 w15 w16se w16cid w16 w16cex w16sdtdh w16sdtfl w16du wp14">
+  <w:footnote w:type="separator" w:id="-1">
+    <w:p>
+      <w:r>
+        <w:separator/>
+      </w:r>
+    </w:p>
+  </w:footnote>
+  <w:footnote w:type="continuationSeparator" w:id="0">
+    <w:p>
+      <w:r>
+        <w:continuationSeparator/>
+      </w:r>
+    </w:p>
+  </w:footnote>
+</w:footnotes>
 </file>
 
 <file path=word/styles.xml><?xml version="1.0" encoding="utf-8"?>
@@ -2699,6 +2737,64 @@
     <w:link w:val="BodyText"/>
     <w:rsid w:val="000E1D95"/>
   </w:style>
+  <w:style w:type="paragraph" w:styleId="Header">
+    <w:name w:val="header"/>
+    <w:basedOn w:val="Normal"/>
+    <w:link w:val="HeaderChar"/>
+    <w:uiPriority w:val="99"/>
+    <w:unhideWhenUsed/>
+    <w:rsid w:val="00BF3E22"/>
+    <w:pPr>
+      <w:tabs>
+        <w:tab w:val="center" w:pos="4680"/>
+        <w:tab w:val="right" w:pos="9360"/>
+      </w:tabs>
+    </w:pPr>
+    <w:rPr>
+      <w:rFonts w:cs="Mangal"/>
+      <w:szCs w:val="21"/>
+    </w:rPr>
+  </w:style>
+  <w:style w:type="character" w:customStyle="1" w:styleId="HeaderChar">
+    <w:name w:val="Header Char"/>
+    <w:basedOn w:val="DefaultParagraphFont"/>
+    <w:link w:val="Header"/>
+    <w:uiPriority w:val="99"/>
+    <w:rsid w:val="00BF3E22"/>
+    <w:rPr>
+      <w:rFonts w:cs="Mangal"/>
+      <w:szCs w:val="21"/>
+    </w:rPr>
+  </w:style>
+  <w:style w:type="paragraph" w:styleId="Footer">
+    <w:name w:val="footer"/>
+    <w:basedOn w:val="Normal"/>
+    <w:link w:val="FooterChar"/>
+    <w:uiPriority w:val="99"/>
+    <w:unhideWhenUsed/>
+    <w:rsid w:val="00BF3E22"/>
+    <w:pPr>
+      <w:tabs>
+        <w:tab w:val="center" w:pos="4680"/>
+        <w:tab w:val="right" w:pos="9360"/>
+      </w:tabs>
+    </w:pPr>
+    <w:rPr>
+      <w:rFonts w:cs="Mangal"/>
+      <w:szCs w:val="21"/>
+    </w:rPr>
+  </w:style>
+  <w:style w:type="character" w:customStyle="1" w:styleId="FooterChar">
+    <w:name w:val="Footer Char"/>
+    <w:basedOn w:val="DefaultParagraphFont"/>
+    <w:link w:val="Footer"/>
+    <w:uiPriority w:val="99"/>
+    <w:rsid w:val="00BF3E22"/>
+    <w:rPr>
+      <w:rFonts w:cs="Mangal"/>
+      <w:szCs w:val="21"/>
+    </w:rPr>
+  </w:style>
 </w:styles>
 </file>
 

</xml_diff>

<commit_message>
amending reference to appraisal_value in word template
</commit_message>
<xml_diff>
--- a/property-tax-appeal/templates/tax_appeal_letter_template.docx
+++ b/property-tax-appeal/templates/tax_appeal_letter_template.docx
@@ -436,17 +436,8 @@
           <w:rFonts w:ascii="Aptos" w:hAnsi="Aptos"/>
           <w:color w:val="000000"/>
         </w:rPr>
-        <w:t>!</w:t>
-      </w:r>
-      <w:proofErr w:type="gramStart"/>
-      <w:r>
-        <w:rPr>
-          <w:rFonts w:ascii="Aptos" w:hAnsi="Aptos"/>
-          <w:color w:val="000000"/>
-        </w:rPr>
-        <w:t>= ‘’</w:t>
-      </w:r>
-      <w:proofErr w:type="gramEnd"/>
+        <w:t>&gt; 0</w:t>
+      </w:r>
       <w:r>
         <w:rPr>
           <w:rFonts w:ascii="Aptos" w:hAnsi="Aptos"/>
@@ -1546,7 +1537,7 @@
           <w:rFonts w:ascii="Aptos" w:hAnsi="Aptos"/>
           <w:color w:val="000000"/>
         </w:rPr>
-        <w:t>value</w:t>
+        <w:t>analysis</w:t>
       </w:r>
       <w:proofErr w:type="spellEnd"/>
       <w:r>

</xml_diff>